<commit_message>
fix: manejo de requests sin JSON valido y regenerar documento de respuestas
</commit_message>
<xml_diff>
--- a/Examen_Final_Respuestas.docx
+++ b/Examen_Final_Respuestas.docx
@@ -2,6 +2,8 @@
 <file path=word/document.xml><?xml version="1.0" encoding="utf-8"?>
 <w:document xmlns:wpc="http://schemas.microsoft.com/office/word/2010/wordprocessingCanvas" xmlns:mo="http://schemas.microsoft.com/office/mac/office/2008/main" xmlns:mc="http://schemas.openxmlformats.org/markup-compatibility/2006" xmlns:mv="urn:schemas-microsoft-com:mac:vml" xmlns:o="urn:schemas-microsoft-com:office:office" xmlns:r="http://schemas.openxmlformats.org/officeDocument/2006/relationships" xmlns:m="http://schemas.openxmlformats.org/officeDocument/2006/math" xmlns:v="urn:schemas-microsoft-com:vml" xmlns:wp14="http://schemas.microsoft.com/office/word/2010/wordprocessingDrawing" xmlns:wp="http://schemas.openxmlformats.org/drawingml/2006/wordprocessingDrawing" xmlns:w10="urn:schemas-microsoft-com:office:word" xmlns:w="http://schemas.openxmlformats.org/wordprocessingml/2006/main" xmlns:w14="http://schemas.microsoft.com/office/word/2010/wordml" xmlns:wpg="http://schemas.microsoft.com/office/word/2010/wordprocessingGroup" xmlns:wpi="http://schemas.microsoft.com/office/word/2010/wordprocessingInk" xmlns:wne="http://schemas.microsoft.com/office/word/2006/wordml" xmlns:wps="http://schemas.microsoft.com/office/word/2010/wordprocessingShape" mc:Ignorable="w14 wp14">
   <w:body>
+    <w:p/>
+    <w:p/>
     <w:p/>
     <w:p/>
     <w:p/>
@@ -13,7 +15,7 @@
       <w:r>
         <w:rPr>
           <w:b/>
-          <w:sz w:val="44"/>
+          <w:sz w:val="40"/>
         </w:rPr>
         <w:t>EXAMEN FINAL</w:t>
       </w:r>
@@ -24,8 +26,7 @@
       </w:pPr>
       <w:r>
         <w:rPr>
-          <w:color w:val="505050"/>
-          <w:sz w:val="32"/>
+          <w:sz w:val="28"/>
         </w:rPr>
         <w:t>Ingenieria de Software II</w:t>
       </w:r>
@@ -36,22 +37,7 @@
         <w:jc w:val="center"/>
       </w:pPr>
       <w:r>
-        <w:rPr>
-          <w:sz w:val="28"/>
-        </w:rPr>
-        <w:t>Sistema de Gestion de Tareas</w:t>
-      </w:r>
-    </w:p>
-    <w:p/>
-    <w:p>
-      <w:pPr>
-        <w:jc w:val="center"/>
-      </w:pPr>
-      <w:r>
-        <w:rPr>
-          <w:sz w:val="20"/>
-        </w:rPr>
-        <w:t>Repositorio: https://github.com/tunek12421/project-exam-ingenieria-software</w:t>
+        <w:t>Enrique Lujan</w:t>
       </w:r>
     </w:p>
     <w:p>
@@ -59,10 +45,15 @@
         <w:jc w:val="center"/>
       </w:pPr>
       <w:r>
-        <w:rPr>
-          <w:sz w:val="20"/>
-        </w:rPr>
-        <w:t>Rama: examen-final</w:t>
+        <w:t>Repositorio: github.com/tunek12421/project-exam-ingenieria-software</w:t>
+      </w:r>
+    </w:p>
+    <w:p>
+      <w:pPr>
+        <w:jc w:val="center"/>
+      </w:pPr>
+      <w:r>
+        <w:t>Rama: examen-enrique-lujan</w:t>
       </w:r>
     </w:p>
     <w:p>
@@ -75,7 +66,7 @@
         <w:pStyle w:val="Heading1"/>
       </w:pPr>
       <w:r>
-        <w:t>A. Parte Teorica (10 puntos)</w:t>
+        <w:t>A. Parte Teorica</w:t>
       </w:r>
     </w:p>
     <w:p>
@@ -83,17 +74,17 @@
         <w:pStyle w:val="Heading2"/>
       </w:pPr>
       <w:r>
-        <w:t>1. Diferencia entre arquitectura monolitica y arquitectura por capas</w:t>
+        <w:t>1. Diferencia entre arquitectura monolitica y por capas</w:t>
       </w:r>
     </w:p>
     <w:p>
       <w:r>
-        <w:t>La arquitectura monolitica agrupa toda la logica del sistema (presentacion, negocio y datos) en un solo bloque desplegable, sin separacion clara de responsabilidades. Cualquier cambio requiere recompilar y redesplegar todo el sistema.</w:t>
+        <w:t>En la monolitica todo el sistema esta en un solo bloque: presentacion, logica y datos juntos. Cualquier cambio obliga a redesplegar todo.</w:t>
       </w:r>
     </w:p>
     <w:p>
       <w:r>
-        <w:t>La arquitectura por capas divide el sistema en capas independientes (presentacion, logica de negocio, acceso a datos), donde cada capa tiene una responsabilidad especifica y se comunica solo con las capas adyacentes. Esto mejora la mantenibilidad, testabilidad y permite modificar una capa sin afectar directamente a las demas.</w:t>
+        <w:t>En la arquitectura por capas se separa en niveles independientes (presentacion, negocio, datos). Cada capa tiene su responsabilidad y solo se comunica con la capa de al lado. Esto hace que sea mas facil de mantener y de probar.</w:t>
       </w:r>
     </w:p>
     <w:p>
@@ -101,12 +92,12 @@
         <w:pStyle w:val="Heading2"/>
       </w:pPr>
       <w:r>
-        <w:t>2. Por que la refactorizacion no debe cambiar la funcionalidad del software</w:t>
+        <w:t>2. Por que la refactorizacion no debe cambiar la funcionalidad</w:t>
       </w:r>
     </w:p>
     <w:p>
       <w:r>
-        <w:t>Porque el objetivo de la refactorizacion es mejorar la estructura interna del codigo (legibilidad, mantenibilidad, eliminacion de duplicados) sin alterar el comportamiento observable del sistema. Si se cambia la funcionalidad, ya no es refactorizacion sino una modificacion funcional, y se pierde la garantia de que el sistema sigue funcionando correctamente. Las pruebas existentes deben seguir pasando antes y despues de la refactorizacion, sirviendo como red de seguridad.</w:t>
+        <w:t>Porque la idea es mejorar como esta escrito el codigo por dentro, no lo que hace. Si cambias el comportamiento ya no es refactorizacion, es otra cosa. Las pruebas que ya existian tienen que seguir pasando igual antes y despues.</w:t>
       </w:r>
     </w:p>
     <w:p>
@@ -114,12 +105,12 @@
         <w:pStyle w:val="Heading2"/>
       </w:pPr>
       <w:r>
-        <w:t>3. Importancia de las pruebas automatizadas en un proyecto de software</w:t>
+        <w:t>3. Importancia de las pruebas automatizadas</w:t>
       </w:r>
     </w:p>
     <w:p>
       <w:r>
-        <w:t>Las pruebas automatizadas permiten detectar errores de forma temprana y repetible, sin intervencion manual. Garantizan que los cambios en el codigo (refactorizaciones, nuevas funcionalidades) no rompan la funcionalidad existente (pruebas de regresion). Reducen costos a largo plazo, aumentan la confianza en el codigo, facilitan la integracion continua (CI/CD) y sirven como documentacion viva del comportamiento esperado del sistema.</w:t>
+        <w:t>Permiten detectar errores rapido y de forma repetible sin tener que probar a mano cada vez. Cuando haces cambios en el codigo, las pruebas te avisan si rompiste algo que antes funcionaba. Tambien sirven como documentacion de como debe comportarse el sistema.</w:t>
       </w:r>
     </w:p>
     <w:p>
@@ -132,7 +123,7 @@
         <w:pStyle w:val="Heading1"/>
       </w:pPr>
       <w:r>
-        <w:t>B. Parte Practica (90 puntos)</w:t>
+        <w:t>B. Parte Practica</w:t>
       </w:r>
     </w:p>
     <w:p>
@@ -140,12 +131,12 @@
         <w:pStyle w:val="Heading2"/>
       </w:pPr>
       <w:r>
-        <w:t>Actividad 1: Organizacion inicial del proyecto y control de versiones</w:t>
+        <w:t>Actividad 1 - Organizacion y control de versiones</w:t>
       </w:r>
     </w:p>
     <w:p>
       <w:r>
-        <w:t>Tecnologias utilizadas:</w:t>
+        <w:t>Stack usado:</w:t>
       </w:r>
     </w:p>
     <w:p>
@@ -153,7 +144,7 @@
         <w:pStyle w:val="ListBullet"/>
       </w:pPr>
       <w:r>
-        <w:t>Backend: Python 3 con Flask</w:t>
+        <w:t>Backend: Python 3 + Flask</w:t>
       </w:r>
     </w:p>
     <w:p>
@@ -161,7 +152,7 @@
         <w:pStyle w:val="ListBullet"/>
       </w:pPr>
       <w:r>
-        <w:t>Frontend: HTML5, CSS3, JavaScript vanilla</w:t>
+        <w:t>Frontend: HTML/CSS/JS</w:t>
       </w:r>
     </w:p>
     <w:p>
@@ -169,7 +160,7 @@
         <w:pStyle w:val="ListBullet"/>
       </w:pPr>
       <w:r>
-        <w:t>Base de datos: SQLite</w:t>
+        <w:t>BD: SQLite</w:t>
       </w:r>
     </w:p>
     <w:p>
@@ -177,7 +168,7 @@
         <w:pStyle w:val="ListBullet"/>
       </w:pPr>
       <w:r>
-        <w:t>Pruebas: unittest + pytest</w:t>
+        <w:t>Tests: pytest</w:t>
       </w:r>
     </w:p>
     <w:p>
@@ -185,7 +176,7 @@
         <w:pStyle w:val="ListBullet"/>
       </w:pPr>
       <w:r>
-        <w:t>Contenedores: Docker + Docker Compose</w:t>
+        <w:t>Docker + Docker Compose</w:t>
       </w:r>
     </w:p>
     <w:p/>
@@ -198,94 +189,64 @@
       <w:r>
         <w:rPr>
           <w:rFonts w:ascii="Consolas" w:hAnsi="Consolas"/>
-          <w:sz w:val="16"/>
+          <w:sz w:val="18"/>
         </w:rPr>
         <w:t>project-exam/</w:t>
         <w:br/>
-        <w:t>├── backend/</w:t>
+        <w:t xml:space="preserve">  backend/src/ -&gt; config, controllers, services, models, repositories</w:t>
         <w:br/>
-        <w:t>│   ├── src/</w:t>
+        <w:t xml:space="preserve">  backend/tests/ -&gt; pruebas unitarias</w:t>
         <w:br/>
-        <w:t>│   │   ├── config/         # Configuracion de BD + constantes</w:t>
+        <w:t xml:space="preserve">  frontend/src/ -&gt; components, pages, services, assets</w:t>
         <w:br/>
-        <w:t>│   │   ├── controllers/    # Endpoints REST (Flask Blueprints)</w:t>
+        <w:t xml:space="preserve">  database/ -&gt; schema.sql, seed.sql</w:t>
         <w:br/>
-        <w:t>│   │   ├── services/       # Logica de negocio y validaciones</w:t>
+        <w:t xml:space="preserve">  tests/integration/ -&gt; pruebas de integracion</w:t>
         <w:br/>
-        <w:t>│   │   ├── models/         # Modelo de datos Task</w:t>
+        <w:t xml:space="preserve">  docs/architecture.md</w:t>
         <w:br/>
-        <w:t>│   │   └── repositories/   # Acceso a datos (queries SQL)</w:t>
-        <w:br/>
-        <w:t>│   └── tests/              # Pruebas unitarias</w:t>
-        <w:br/>
-        <w:t>├── frontend/</w:t>
-        <w:br/>
-        <w:t>│   ├── src/</w:t>
-        <w:br/>
-        <w:t>│   │   ├── components/     # Componentes (task_card)</w:t>
-        <w:br/>
-        <w:t>│   │   ├── pages/          # Logica de paginas (main)</w:t>
-        <w:br/>
-        <w:t>│   │   ├── services/       # Cliente API (api_service)</w:t>
-        <w:br/>
-        <w:t>│   │   └── assets/         # Estilos CSS</w:t>
-        <w:br/>
-        <w:t>│   └── index.html</w:t>
-        <w:br/>
-        <w:t>├── database/</w:t>
-        <w:br/>
-        <w:t>│   ├── schema.sql          # Esquema de la BD</w:t>
-        <w:br/>
-        <w:t>│   └── seed.sql            # Datos iniciales</w:t>
-        <w:br/>
-        <w:t>├── docs/</w:t>
-        <w:br/>
-        <w:t>│   └── architecture.md</w:t>
-        <w:br/>
-        <w:t>├── tests/integration/      # Pruebas de integracion</w:t>
-        <w:br/>
-        <w:t>├── Dockerfile</w:t>
-        <w:br/>
-        <w:t>├── docker-compose.yml</w:t>
-        <w:br/>
-        <w:t>├── requirements.txt</w:t>
-        <w:br/>
-        <w:t>├── .gitignore</w:t>
-        <w:br/>
-        <w:t>├── .dockerignore</w:t>
-        <w:br/>
-        <w:t>└── README.md</w:t>
+        <w:t xml:space="preserve">  Dockerfile, docker-compose.yml, README.md</w:t>
       </w:r>
     </w:p>
     <w:p/>
     <w:p>
       <w:r>
-        <w:t>Historial de commits en rama examen-final:</w:t>
+        <w:t>Commits realizados en la rama examen-enrique-lujan:</w:t>
       </w:r>
     </w:p>
     <w:p>
       <w:r>
-        <w:t>1. feat: estructura base del proyecto con modelo, repositorio y configuracion de BD</w:t>
+        <w:t>1. feat: estructura base con modelo, repositorio y configuracion de BD</w:t>
       </w:r>
     </w:p>
     <w:p>
       <w:r>
-        <w:t>2. feat: implementacion de API REST y frontend para gestion de tareas</w:t>
+        <w:t>2. feat: implementacion de API REST y frontend</w:t>
       </w:r>
     </w:p>
     <w:p>
       <w:r>
-        <w:t>3. test: pruebas unitarias e integracion + documentacion arquitectonica</w:t>
+        <w:t>3. test: pruebas unitarias e integracion + documentacion</w:t>
       </w:r>
     </w:p>
     <w:p>
       <w:r>
-        <w:t>4. refactor: correccion de code smells y mejora de calidad de codigo</w:t>
+        <w:t>4. refactor: correccion de code smells</w:t>
       </w:r>
     </w:p>
     <w:p>
       <w:r>
-        <w:t>5. feat: dockerizacion del proyecto con Dockerfile y docker-compose</w:t>
+        <w:t>5. feat: dockerizacion con Dockerfile y docker-compose</w:t>
+      </w:r>
+    </w:p>
+    <w:p>
+      <w:r>
+        <w:t>6. docs: actualizacion del README</w:t>
+      </w:r>
+    </w:p>
+    <w:p>
+      <w:r>
+        <w:t>7. feat: rediseno con listas de tareas, subtareas y progreso circular</w:t>
       </w:r>
     </w:p>
     <w:p>
@@ -293,20 +254,12 @@
         <w:pStyle w:val="Heading2"/>
       </w:pPr>
       <w:r>
-        <w:t>Actividad 2: Identificacion de estructura y arquitectura del sistema</w:t>
-      </w:r>
-    </w:p>
-    <w:p>
-      <w:pPr>
-        <w:pStyle w:val="Heading3"/>
-      </w:pPr>
-      <w:r>
-        <w:t>Tipo de arquitectura</w:t>
+        <w:t>Actividad 2 - Arquitectura del sistema</w:t>
       </w:r>
     </w:p>
     <w:p>
       <w:r>
-        <w:t>El proyecto implementa una arquitectura por capas (Layered Architecture) con separacion clara de responsabilidades:</w:t>
+        <w:t>El proyecto usa una arquitectura por capas. Cada parte tiene una responsabilidad clara:</w:t>
       </w:r>
     </w:p>
     <w:p>
@@ -314,7 +267,7 @@
         <w:pStyle w:val="ListBullet"/>
       </w:pPr>
       <w:r>
-        <w:t>Capa de presentacion (Frontend): Interfaz HTML/CSS/JS que consume la API REST.</w:t>
+        <w:t>Frontend (HTML/JS) -&gt; lo que ve el usuario, consume la API</w:t>
       </w:r>
     </w:p>
     <w:p>
@@ -322,7 +275,7 @@
         <w:pStyle w:val="ListBullet"/>
       </w:pPr>
       <w:r>
-        <w:t>Capa de controladores: Recibe peticiones HTTP, delega al servicio correspondiente.</w:t>
+        <w:t>Controllers -&gt; reciben las peticiones HTTP y las pasan al servicio</w:t>
       </w:r>
     </w:p>
     <w:p>
@@ -330,7 +283,7 @@
         <w:pStyle w:val="ListBullet"/>
       </w:pPr>
       <w:r>
-        <w:t>Capa de servicios (Logica de negocio): Validaciones y reglas de negocio.</w:t>
+        <w:t>Services -&gt; logica de negocio y validaciones</w:t>
       </w:r>
     </w:p>
     <w:p>
@@ -338,7 +291,7 @@
         <w:pStyle w:val="ListBullet"/>
       </w:pPr>
       <w:r>
-        <w:t>Capa de repositorios (Acceso a datos): Encapsula consultas SQL.</w:t>
+        <w:t>Repositories -&gt; consultas a la base de datos</w:t>
       </w:r>
     </w:p>
     <w:p>
@@ -346,210 +299,13 @@
         <w:pStyle w:val="ListBullet"/>
       </w:pPr>
       <w:r>
-        <w:t>Capa de modelos: Define las entidades del dominio.</w:t>
+        <w:t>Models -&gt; definen la estructura de los datos (TaskList, Subtask)</w:t>
       </w:r>
     </w:p>
+    <w:p/>
     <w:p>
-      <w:pPr>
-        <w:pStyle w:val="Heading3"/>
-      </w:pPr>
       <w:r>
-        <w:t>Modulos identificados</w:t>
-      </w:r>
-    </w:p>
-    <w:tbl>
-      <w:tblPr>
-        <w:tblStyle w:val="TableGrid"/>
-        <w:tblW w:type="auto" w:w="0"/>
-        <w:tblLook w:firstColumn="1" w:firstRow="1" w:lastColumn="0" w:lastRow="0" w:noHBand="0" w:noVBand="1" w:val="04A0"/>
-      </w:tblPr>
-      <w:tblGrid>
-        <w:gridCol w:w="4320"/>
-        <w:gridCol w:w="4320"/>
-      </w:tblGrid>
-      <w:tr>
-        <w:tc>
-          <w:tcPr>
-            <w:tcW w:type="dxa" w:w="4320"/>
-          </w:tcPr>
-          <w:p>
-            <w:r>
-              <w:t>Modulo</w:t>
-            </w:r>
-          </w:p>
-        </w:tc>
-        <w:tc>
-          <w:tcPr>
-            <w:tcW w:type="dxa" w:w="4320"/>
-          </w:tcPr>
-          <w:p>
-            <w:r>
-              <w:t>Responsabilidad</w:t>
-            </w:r>
-          </w:p>
-        </w:tc>
-      </w:tr>
-      <w:tr>
-        <w:tc>
-          <w:tcPr>
-            <w:tcW w:type="dxa" w:w="4320"/>
-          </w:tcPr>
-          <w:p>
-            <w:r>
-              <w:t>config/database.py</w:t>
-            </w:r>
-          </w:p>
-        </w:tc>
-        <w:tc>
-          <w:tcPr>
-            <w:tcW w:type="dxa" w:w="4320"/>
-          </w:tcPr>
-          <w:p>
-            <w:r>
-              <w:t>Conexion SQLite con context manager + constantes</w:t>
-            </w:r>
-          </w:p>
-        </w:tc>
-      </w:tr>
-      <w:tr>
-        <w:tc>
-          <w:tcPr>
-            <w:tcW w:type="dxa" w:w="4320"/>
-          </w:tcPr>
-          <w:p>
-            <w:r>
-              <w:t>models/task_model.py</w:t>
-            </w:r>
-          </w:p>
-        </w:tc>
-        <w:tc>
-          <w:tcPr>
-            <w:tcW w:type="dxa" w:w="4320"/>
-          </w:tcPr>
-          <w:p>
-            <w:r>
-              <w:t>Modelo Task con serializacion y deserializacion</w:t>
-            </w:r>
-          </w:p>
-        </w:tc>
-      </w:tr>
-      <w:tr>
-        <w:tc>
-          <w:tcPr>
-            <w:tcW w:type="dxa" w:w="4320"/>
-          </w:tcPr>
-          <w:p>
-            <w:r>
-              <w:t>repositories/task_repository.py</w:t>
-            </w:r>
-          </w:p>
-        </w:tc>
-        <w:tc>
-          <w:tcPr>
-            <w:tcW w:type="dxa" w:w="4320"/>
-          </w:tcPr>
-          <w:p>
-            <w:r>
-              <w:t>CRUD a nivel de base de datos</w:t>
-            </w:r>
-          </w:p>
-        </w:tc>
-      </w:tr>
-      <w:tr>
-        <w:tc>
-          <w:tcPr>
-            <w:tcW w:type="dxa" w:w="4320"/>
-          </w:tcPr>
-          <w:p>
-            <w:r>
-              <w:t>services/task_service.py</w:t>
-            </w:r>
-          </w:p>
-        </w:tc>
-        <w:tc>
-          <w:tcPr>
-            <w:tcW w:type="dxa" w:w="4320"/>
-          </w:tcPr>
-          <w:p>
-            <w:r>
-              <w:t>Validaciones y logica de negocio</w:t>
-            </w:r>
-          </w:p>
-        </w:tc>
-      </w:tr>
-      <w:tr>
-        <w:tc>
-          <w:tcPr>
-            <w:tcW w:type="dxa" w:w="4320"/>
-          </w:tcPr>
-          <w:p>
-            <w:r>
-              <w:t>controllers/task_controller.py</w:t>
-            </w:r>
-          </w:p>
-        </w:tc>
-        <w:tc>
-          <w:tcPr>
-            <w:tcW w:type="dxa" w:w="4320"/>
-          </w:tcPr>
-          <w:p>
-            <w:r>
-              <w:t>Endpoints REST de la API</w:t>
-            </w:r>
-          </w:p>
-        </w:tc>
-      </w:tr>
-      <w:tr>
-        <w:tc>
-          <w:tcPr>
-            <w:tcW w:type="dxa" w:w="4320"/>
-          </w:tcPr>
-          <w:p>
-            <w:r>
-              <w:t>frontend/src/services/</w:t>
-            </w:r>
-          </w:p>
-        </w:tc>
-        <w:tc>
-          <w:tcPr>
-            <w:tcW w:type="dxa" w:w="4320"/>
-          </w:tcPr>
-          <w:p>
-            <w:r>
-              <w:t>Cliente HTTP para consumir la API</w:t>
-            </w:r>
-          </w:p>
-        </w:tc>
-      </w:tr>
-      <w:tr>
-        <w:tc>
-          <w:tcPr>
-            <w:tcW w:type="dxa" w:w="4320"/>
-          </w:tcPr>
-          <w:p>
-            <w:r>
-              <w:t>frontend/src/components/</w:t>
-            </w:r>
-          </w:p>
-        </w:tc>
-        <w:tc>
-          <w:tcPr>
-            <w:tcW w:type="dxa" w:w="4320"/>
-          </w:tcPr>
-          <w:p>
-            <w:r>
-              <w:t>Componentes visuales reutilizables</w:t>
-            </w:r>
-          </w:p>
-        </w:tc>
-      </w:tr>
-    </w:tbl>
-    <w:p>
-      <w:pPr>
-        <w:pStyle w:val="Heading3"/>
-      </w:pPr>
-      <w:r>
-        <w:t>Mejoras arquitectonicas propuestas</w:t>
+        <w:t>Mejoras que se podrian hacer:</w:t>
       </w:r>
     </w:p>
     <w:p>
@@ -557,7 +313,7 @@
         <w:pStyle w:val="ListBullet"/>
       </w:pPr>
       <w:r>
-        <w:t>Inyeccion de dependencias formal con contenedor DI.</w:t>
+        <w:t>Usar un sistema de migraciones como Alembic en vez de schema.sql</w:t>
       </w:r>
     </w:p>
     <w:p>
@@ -565,7 +321,7 @@
         <w:pStyle w:val="ListBullet"/>
       </w:pPr>
       <w:r>
-        <w:t>Sistema de migraciones (Alembic) en lugar de schema.sql directo.</w:t>
+        <w:t>Agregar autenticacion con JWT</w:t>
       </w:r>
     </w:p>
     <w:p>
@@ -573,7 +329,7 @@
         <w:pStyle w:val="ListBullet"/>
       </w:pPr>
       <w:r>
-        <w:t>Middleware centralizado de manejo de errores en Flask.</w:t>
+        <w:t>Manejo centralizado de errores con un middleware</w:t>
       </w:r>
     </w:p>
     <w:p>
@@ -581,7 +337,195 @@
         <w:pStyle w:val="ListBullet"/>
       </w:pPr>
       <w:r>
-        <w:t>Autenticacion con JWT para proteger endpoints.</w:t>
+        <w:t>Migrar el frontend a un framework como Vue o React</w:t>
+      </w:r>
+    </w:p>
+    <w:p>
+      <w:pPr>
+        <w:pStyle w:val="Heading2"/>
+      </w:pPr>
+      <w:r>
+        <w:t>Actividad 3 - Refactorizacion</w:t>
+      </w:r>
+    </w:p>
+    <w:p>
+      <w:r>
+        <w:t>Problemas que encontre y como los corregi:</w:t>
+      </w:r>
+    </w:p>
+    <w:p/>
+    <w:p>
+      <w:r>
+        <w:rPr>
+          <w:b/>
+        </w:rPr>
+        <w:t xml:space="preserve">Problema: </w:t>
+      </w:r>
+      <w:r>
+        <w:t>Conexiones a la BD no se cerraban si habia error</w:t>
+      </w:r>
+    </w:p>
+    <w:p>
+      <w:r>
+        <w:rPr>
+          <w:b/>
+        </w:rPr>
+        <w:t xml:space="preserve">Solucion: </w:t>
+      </w:r>
+      <w:r>
+        <w:t>Use context manager (with) para que siempre se cierre la conexion</w:t>
+      </w:r>
+    </w:p>
+    <w:p/>
+    <w:p>
+      <w:r>
+        <w:rPr>
+          <w:b/>
+        </w:rPr>
+        <w:t xml:space="preserve">Problema: </w:t>
+      </w:r>
+      <w:r>
+        <w:t>La misma query SQL repetida en 3 metodos</w:t>
+      </w:r>
+    </w:p>
+    <w:p>
+      <w:r>
+        <w:rPr>
+          <w:b/>
+        </w:rPr>
+        <w:t xml:space="preserve">Solucion: </w:t>
+      </w:r>
+      <w:r>
+        <w:t>La extraje a una constante _BASE_SELECT</w:t>
+      </w:r>
+    </w:p>
+    <w:p/>
+    <w:p>
+      <w:r>
+        <w:rPr>
+          <w:b/>
+        </w:rPr>
+        <w:t xml:space="preserve">Problema: </w:t>
+      </w:r>
+      <w:r>
+        <w:t>Import de datetime que no se usaba</w:t>
+      </w:r>
+    </w:p>
+    <w:p>
+      <w:r>
+        <w:rPr>
+          <w:b/>
+        </w:rPr>
+        <w:t xml:space="preserve">Solucion: </w:t>
+      </w:r>
+      <w:r>
+        <w:t>Lo elimine</w:t>
+      </w:r>
+    </w:p>
+    <w:p/>
+    <w:p>
+      <w:r>
+        <w:rPr>
+          <w:b/>
+        </w:rPr>
+        <w:t xml:space="preserve">Problema: </w:t>
+      </w:r>
+      <w:r>
+        <w:t>El numero 200 estaba puesto directo en el codigo</w:t>
+      </w:r>
+    </w:p>
+    <w:p>
+      <w:r>
+        <w:rPr>
+          <w:b/>
+        </w:rPr>
+        <w:t xml:space="preserve">Solucion: </w:t>
+      </w:r>
+      <w:r>
+        <w:t>Lo movi a una constante TITLE_MAX_LENGTH en config</w:t>
+      </w:r>
+    </w:p>
+    <w:p/>
+    <w:p>
+      <w:r>
+        <w:rPr>
+          <w:b/>
+        </w:rPr>
+        <w:t xml:space="preserve">Problema: </w:t>
+      </w:r>
+      <w:r>
+        <w:t>La misma validacion de "tarea no encontrada" en dos metodos</w:t>
+      </w:r>
+    </w:p>
+    <w:p>
+      <w:r>
+        <w:rPr>
+          <w:b/>
+        </w:rPr>
+        <w:t xml:space="preserve">Solucion: </w:t>
+      </w:r>
+      <w:r>
+        <w:t>Cree un metodo reutilizable _find_list_or_raise()</w:t>
+      </w:r>
+    </w:p>
+    <w:p/>
+    <w:p>
+      <w:r>
+        <w:rPr>
+          <w:b/>
+        </w:rPr>
+        <w:t xml:space="preserve">Problema: </w:t>
+      </w:r>
+      <w:r>
+        <w:t>No habia validacion en el frontend antes de enviar datos</w:t>
+      </w:r>
+    </w:p>
+    <w:p>
+      <w:r>
+        <w:rPr>
+          <w:b/>
+        </w:rPr>
+        <w:t xml:space="preserve">Solucion: </w:t>
+      </w:r>
+      <w:r>
+        <w:t>Agregue trim() y verificacion de campo vacio</w:t>
+      </w:r>
+    </w:p>
+    <w:p/>
+    <w:p>
+      <w:r>
+        <w:rPr>
+          <w:b/>
+        </w:rPr>
+        <w:t xml:space="preserve">Problema: </w:t>
+      </w:r>
+      <w:r>
+        <w:t>No habia aviso cuando algo salia bien</w:t>
+      </w:r>
+    </w:p>
+    <w:p>
+      <w:r>
+        <w:rPr>
+          <w:b/>
+        </w:rPr>
+        <w:t xml:space="preserve">Solucion: </w:t>
+      </w:r>
+      <w:r>
+        <w:t>Agregue notificaciones tipo toast</w:t>
+      </w:r>
+    </w:p>
+    <w:p/>
+    <w:p>
+      <w:pPr>
+        <w:pStyle w:val="Heading2"/>
+      </w:pPr>
+      <w:r>
+        <w:t>Actividad 4 - Funcionalidad implementada</w:t>
+      </w:r>
+    </w:p>
+    <w:p>
+      <w:r>
+        <w:t>El sistema permite:</w:t>
       </w:r>
     </w:p>
     <w:p>
@@ -589,7 +533,127 @@
         <w:pStyle w:val="ListBullet"/>
       </w:pPr>
       <w:r>
-        <w:t>Migrar frontend a framework (Vue/React) para mejor escalabilidad.</w:t>
+        <w:t>Crear listas de tareas con titulo y descripcion</w:t>
+      </w:r>
+    </w:p>
+    <w:p>
+      <w:pPr>
+        <w:pStyle w:val="ListBullet"/>
+      </w:pPr>
+      <w:r>
+        <w:t>Agregar subtareas dentro de cada lista</w:t>
+      </w:r>
+    </w:p>
+    <w:p>
+      <w:pPr>
+        <w:pStyle w:val="ListBullet"/>
+      </w:pPr>
+      <w:r>
+        <w:t>Marcar y desmarcar subtareas (toggle)</w:t>
+      </w:r>
+    </w:p>
+    <w:p>
+      <w:pPr>
+        <w:pStyle w:val="ListBullet"/>
+      </w:pPr>
+      <w:r>
+        <w:t>Ver el porcentaje de avance con un circulo de progreso</w:t>
+      </w:r>
+    </w:p>
+    <w:p>
+      <w:pPr>
+        <w:pStyle w:val="ListBullet"/>
+      </w:pPr>
+      <w:r>
+        <w:t>Expandir y colapsar las subtareas de cada lista</w:t>
+      </w:r>
+    </w:p>
+    <w:p>
+      <w:pPr>
+        <w:pStyle w:val="ListBullet"/>
+      </w:pPr>
+      <w:r>
+        <w:t>Eliminar listas y subtareas</w:t>
+      </w:r>
+    </w:p>
+    <w:p>
+      <w:pPr>
+        <w:pStyle w:val="ListBullet"/>
+      </w:pPr>
+      <w:r>
+        <w:t>Validacion de campos vacios en frontend y backend</w:t>
+      </w:r>
+    </w:p>
+    <w:p/>
+    <w:p>
+      <w:r>
+        <w:t>Endpoints de la API:</w:t>
+      </w:r>
+    </w:p>
+    <w:p>
+      <w:r>
+        <w:rPr>
+          <w:b/>
+        </w:rPr>
+        <w:t>GET /api/task-lists</w:t>
+      </w:r>
+      <w:r>
+        <w:t xml:space="preserve"> - Obtener todas las listas con subtareas</w:t>
+      </w:r>
+    </w:p>
+    <w:p>
+      <w:r>
+        <w:rPr>
+          <w:b/>
+        </w:rPr>
+        <w:t>POST /api/task-lists</w:t>
+      </w:r>
+      <w:r>
+        <w:t xml:space="preserve"> - Crear una lista nueva</w:t>
+      </w:r>
+    </w:p>
+    <w:p>
+      <w:r>
+        <w:rPr>
+          <w:b/>
+        </w:rPr>
+        <w:t>DELETE /api/task-lists/&lt;id&gt;</w:t>
+      </w:r>
+      <w:r>
+        <w:t xml:space="preserve"> - Eliminar una lista</w:t>
+      </w:r>
+    </w:p>
+    <w:p>
+      <w:r>
+        <w:rPr>
+          <w:b/>
+        </w:rPr>
+        <w:t>POST /api/task-lists/&lt;id&gt;/subtasks</w:t>
+      </w:r>
+      <w:r>
+        <w:t xml:space="preserve"> - Agregar subtarea a una lista</w:t>
+      </w:r>
+    </w:p>
+    <w:p>
+      <w:r>
+        <w:rPr>
+          <w:b/>
+        </w:rPr>
+        <w:t>PATCH /api/subtasks/&lt;id&gt;/toggle</w:t>
+      </w:r>
+      <w:r>
+        <w:t xml:space="preserve"> - Marcar o desmarcar subtarea</w:t>
+      </w:r>
+    </w:p>
+    <w:p>
+      <w:r>
+        <w:rPr>
+          <w:b/>
+        </w:rPr>
+        <w:t>DELETE /api/subtasks/&lt;id&gt;</w:t>
+      </w:r>
+      <w:r>
+        <w:t xml:space="preserve"> - Eliminar una subtarea</w:t>
       </w:r>
     </w:p>
     <w:p>
@@ -597,293 +661,18 @@
         <w:pStyle w:val="Heading2"/>
       </w:pPr>
       <w:r>
-        <w:t>Actividad 3: Refactorizacion de codigo</w:t>
+        <w:t>Actividad 5 - Pruebas</w:t>
       </w:r>
     </w:p>
     <w:p>
       <w:r>
-        <w:t>Code smells identificados y corregidos:</w:t>
+        <w:t>Se crearon 21 pruebas automatizadas. Todas pasan.</w:t>
       </w:r>
     </w:p>
-    <w:tbl>
-      <w:tblPr>
-        <w:tblStyle w:val="TableGrid"/>
-        <w:tblW w:type="auto" w:w="0"/>
-        <w:tblLook w:firstColumn="1" w:firstRow="1" w:lastColumn="0" w:lastRow="0" w:noHBand="0" w:noVBand="1" w:val="04A0"/>
-      </w:tblPr>
-      <w:tblGrid>
-        <w:gridCol w:w="2880"/>
-        <w:gridCol w:w="2880"/>
-        <w:gridCol w:w="2880"/>
-      </w:tblGrid>
-      <w:tr>
-        <w:tc>
-          <w:tcPr>
-            <w:tcW w:type="dxa" w:w="2880"/>
-          </w:tcPr>
-          <w:p>
-            <w:r>
-              <w:t>Code Smell</w:t>
-            </w:r>
-          </w:p>
-        </w:tc>
-        <w:tc>
-          <w:tcPr>
-            <w:tcW w:type="dxa" w:w="2880"/>
-          </w:tcPr>
-          <w:p>
-            <w:r>
-              <w:t>Problema</w:t>
-            </w:r>
-          </w:p>
-        </w:tc>
-        <w:tc>
-          <w:tcPr>
-            <w:tcW w:type="dxa" w:w="2880"/>
-          </w:tcPr>
-          <w:p>
-            <w:r>
-              <w:t>Solucion aplicada</w:t>
-            </w:r>
-          </w:p>
-        </w:tc>
-      </w:tr>
-      <w:tr>
-        <w:tc>
-          <w:tcPr>
-            <w:tcW w:type="dxa" w:w="2880"/>
-          </w:tcPr>
-          <w:p>
-            <w:r>
-              <w:t>Resource Leak (CRITICO)</w:t>
-            </w:r>
-          </w:p>
-        </w:tc>
-        <w:tc>
-          <w:tcPr>
-            <w:tcW w:type="dxa" w:w="2880"/>
-          </w:tcPr>
-          <w:p>
-            <w:r>
-              <w:t>Conexiones a BD sin try/finally</w:t>
-            </w:r>
-          </w:p>
-        </w:tc>
-        <w:tc>
-          <w:tcPr>
-            <w:tcW w:type="dxa" w:w="2880"/>
-          </w:tcPr>
-          <w:p>
-            <w:r>
-              <w:t>Se implemento context manager con @contextmanager para garantizar cierre seguro de conexiones.</w:t>
-            </w:r>
-          </w:p>
-        </w:tc>
-      </w:tr>
-      <w:tr>
-        <w:tc>
-          <w:tcPr>
-            <w:tcW w:type="dxa" w:w="2880"/>
-          </w:tcPr>
-          <w:p>
-            <w:r>
-              <w:t>Codigo SQL duplicado</w:t>
-            </w:r>
-          </w:p>
-        </w:tc>
-        <w:tc>
-          <w:tcPr>
-            <w:tcW w:type="dxa" w:w="2880"/>
-          </w:tcPr>
-          <w:p>
-            <w:r>
-              <w:t>Misma query SELECT repetida en 3 metodos del repositorio</w:t>
-            </w:r>
-          </w:p>
-        </w:tc>
-        <w:tc>
-          <w:tcPr>
-            <w:tcW w:type="dxa" w:w="2880"/>
-          </w:tcPr>
-          <w:p>
-            <w:r>
-              <w:t>Se extrajo a constante de clase _BASE_SELECT (principio DRY).</w:t>
-            </w:r>
-          </w:p>
-        </w:tc>
-      </w:tr>
-      <w:tr>
-        <w:tc>
-          <w:tcPr>
-            <w:tcW w:type="dxa" w:w="2880"/>
-          </w:tcPr>
-          <w:p>
-            <w:r>
-              <w:t>Import sin usar</w:t>
-            </w:r>
-          </w:p>
-        </w:tc>
-        <w:tc>
-          <w:tcPr>
-            <w:tcW w:type="dxa" w:w="2880"/>
-          </w:tcPr>
-          <w:p>
-            <w:r>
-              <w:t>from datetime import datetime en task_model.py</w:t>
-            </w:r>
-          </w:p>
-        </w:tc>
-        <w:tc>
-          <w:tcPr>
-            <w:tcW w:type="dxa" w:w="2880"/>
-          </w:tcPr>
-          <w:p>
-            <w:r>
-              <w:t>Se elimino el import no utilizado.</w:t>
-            </w:r>
-          </w:p>
-        </w:tc>
-      </w:tr>
-      <w:tr>
-        <w:tc>
-          <w:tcPr>
-            <w:tcW w:type="dxa" w:w="2880"/>
-          </w:tcPr>
-          <w:p>
-            <w:r>
-              <w:t>Magic number</w:t>
-            </w:r>
-          </w:p>
-        </w:tc>
-        <w:tc>
-          <w:tcPr>
-            <w:tcW w:type="dxa" w:w="2880"/>
-          </w:tcPr>
-          <w:p>
-            <w:r>
-              <w:t>Valor 200 hardcodeado para longitud maxima de titulo</w:t>
-            </w:r>
-          </w:p>
-        </w:tc>
-        <w:tc>
-          <w:tcPr>
-            <w:tcW w:type="dxa" w:w="2880"/>
-          </w:tcPr>
-          <w:p>
-            <w:r>
-              <w:t>Se centralizo en constante TITLE_MAX_LENGTH en config/database.py.</w:t>
-            </w:r>
-          </w:p>
-        </w:tc>
-      </w:tr>
-      <w:tr>
-        <w:tc>
-          <w:tcPr>
-            <w:tcW w:type="dxa" w:w="2880"/>
-          </w:tcPr>
-          <w:p>
-            <w:r>
-              <w:t>Codigo duplicado en servicio</w:t>
-            </w:r>
-          </w:p>
-        </w:tc>
-        <w:tc>
-          <w:tcPr>
-            <w:tcW w:type="dxa" w:w="2880"/>
-          </w:tcPr>
-          <w:p>
-            <w:r>
-              <w:t>Misma validacion de tarea existente en complete_task y delete_task</w:t>
-            </w:r>
-          </w:p>
-        </w:tc>
-        <w:tc>
-          <w:tcPr>
-            <w:tcW w:type="dxa" w:w="2880"/>
-          </w:tcPr>
-          <w:p>
-            <w:r>
-              <w:t>Se extrajo a metodo privado _find_task_or_raise().</w:t>
-            </w:r>
-          </w:p>
-        </w:tc>
-      </w:tr>
-      <w:tr>
-        <w:tc>
-          <w:tcPr>
-            <w:tcW w:type="dxa" w:w="2880"/>
-          </w:tcPr>
-          <w:p>
-            <w:r>
-              <w:t>Sin validacion frontend</w:t>
-            </w:r>
-          </w:p>
-        </w:tc>
-        <w:tc>
-          <w:tcPr>
-            <w:tcW w:type="dxa" w:w="2880"/>
-          </w:tcPr>
-          <w:p>
-            <w:r>
-              <w:t>Datos enviados sin validar al API</w:t>
-            </w:r>
-          </w:p>
-        </w:tc>
-        <w:tc>
-          <w:tcPr>
-            <w:tcW w:type="dxa" w:w="2880"/>
-          </w:tcPr>
-          <w:p>
-            <w:r>
-              <w:t>Se agrego trim() y validacion de titulo vacio antes de enviar.</w:t>
-            </w:r>
-          </w:p>
-        </w:tc>
-      </w:tr>
-      <w:tr>
-        <w:tc>
-          <w:tcPr>
-            <w:tcW w:type="dxa" w:w="2880"/>
-          </w:tcPr>
-          <w:p>
-            <w:r>
-              <w:t>Sin feedback UX</w:t>
-            </w:r>
-          </w:p>
-        </w:tc>
-        <w:tc>
-          <w:tcPr>
-            <w:tcW w:type="dxa" w:w="2880"/>
-          </w:tcPr>
-          <w:p>
-            <w:r>
-              <w:t>Solo alertas de error, sin confirmacion visual de exito</w:t>
-            </w:r>
-          </w:p>
-        </w:tc>
-        <w:tc>
-          <w:tcPr>
-            <w:tcW w:type="dxa" w:w="2880"/>
-          </w:tcPr>
-          <w:p>
-            <w:r>
-              <w:t>Se implemento sistema de notificaciones toast con animacion CSS.</w:t>
-            </w:r>
-          </w:p>
-        </w:tc>
-      </w:tr>
-    </w:tbl>
-    <w:p>
-      <w:pPr>
-        <w:pStyle w:val="Heading2"/>
-      </w:pPr>
-      <w:r>
-        <w:t>Actividad 4: Implementacion de mejora funcional</w:t>
-      </w:r>
-    </w:p>
+    <w:p/>
     <w:p>
       <w:r>
-        <w:t>Funcionalidades implementadas en el sistema:</w:t>
+        <w:t>Unitarias (15):</w:t>
       </w:r>
     </w:p>
     <w:p>
@@ -891,7 +680,7 @@
         <w:pStyle w:val="ListBullet"/>
       </w:pPr>
       <w:r>
-        <w:t>Registrar nueva tarea con titulo y descripcion.</w:t>
+        <w:t>Crear lista con datos validos</w:t>
       </w:r>
     </w:p>
     <w:p>
@@ -899,7 +688,7 @@
         <w:pStyle w:val="ListBullet"/>
       </w:pPr>
       <w:r>
-        <w:t>Listar todas las tareas ordenadas por fecha.</w:t>
+        <w:t>Titulo vacio lanza error</w:t>
       </w:r>
     </w:p>
     <w:p>
@@ -907,7 +696,7 @@
         <w:pStyle w:val="ListBullet"/>
       </w:pPr>
       <w:r>
-        <w:t>Filtrar tareas pendientes (no completadas).</w:t>
+        <w:t>Titulo con solo espacios lanza error</w:t>
       </w:r>
     </w:p>
     <w:p>
@@ -915,7 +704,7 @@
         <w:pStyle w:val="ListBullet"/>
       </w:pPr>
       <w:r>
-        <w:t>Marcar una tarea como completada.</w:t>
+        <w:t>Titulo muy largo lanza error</w:t>
       </w:r>
     </w:p>
     <w:p>
@@ -923,7 +712,7 @@
         <w:pStyle w:val="ListBullet"/>
       </w:pPr>
       <w:r>
-        <w:t>Eliminar una tarea con confirmacion.</w:t>
+        <w:t>Eliminar lista existente</w:t>
       </w:r>
     </w:p>
     <w:p>
@@ -931,7 +720,7 @@
         <w:pStyle w:val="ListBullet"/>
       </w:pPr>
       <w:r>
-        <w:t>Validacion de datos vacios (backend y frontend).</w:t>
+        <w:t>Eliminar lista inexistente lanza error</w:t>
       </w:r>
     </w:p>
     <w:p>
@@ -939,238 +728,7 @@
         <w:pStyle w:val="ListBullet"/>
       </w:pPr>
       <w:r>
-        <w:t>Notificaciones visuales de exito.</w:t>
-      </w:r>
-    </w:p>
-    <w:p/>
-    <w:p>
-      <w:r>
-        <w:t>Endpoints de la API REST:</w:t>
-      </w:r>
-    </w:p>
-    <w:tbl>
-      <w:tblPr>
-        <w:tblStyle w:val="TableGrid"/>
-        <w:tblW w:type="auto" w:w="0"/>
-        <w:tblLook w:firstColumn="1" w:firstRow="1" w:lastColumn="0" w:lastRow="0" w:noHBand="0" w:noVBand="1" w:val="04A0"/>
-      </w:tblPr>
-      <w:tblGrid>
-        <w:gridCol w:w="2880"/>
-        <w:gridCol w:w="2880"/>
-        <w:gridCol w:w="2880"/>
-      </w:tblGrid>
-      <w:tr>
-        <w:tc>
-          <w:tcPr>
-            <w:tcW w:type="dxa" w:w="2880"/>
-          </w:tcPr>
-          <w:p>
-            <w:r>
-              <w:t>Metodo</w:t>
-            </w:r>
-          </w:p>
-        </w:tc>
-        <w:tc>
-          <w:tcPr>
-            <w:tcW w:type="dxa" w:w="2880"/>
-          </w:tcPr>
-          <w:p>
-            <w:r>
-              <w:t>Endpoint</w:t>
-            </w:r>
-          </w:p>
-        </w:tc>
-        <w:tc>
-          <w:tcPr>
-            <w:tcW w:type="dxa" w:w="2880"/>
-          </w:tcPr>
-          <w:p>
-            <w:r>
-              <w:t>Descripcion</w:t>
-            </w:r>
-          </w:p>
-        </w:tc>
-      </w:tr>
-      <w:tr>
-        <w:tc>
-          <w:tcPr>
-            <w:tcW w:type="dxa" w:w="2880"/>
-          </w:tcPr>
-          <w:p>
-            <w:r>
-              <w:t>GET</w:t>
-            </w:r>
-          </w:p>
-        </w:tc>
-        <w:tc>
-          <w:tcPr>
-            <w:tcW w:type="dxa" w:w="2880"/>
-          </w:tcPr>
-          <w:p>
-            <w:r>
-              <w:t>/api/tasks</w:t>
-            </w:r>
-          </w:p>
-        </w:tc>
-        <w:tc>
-          <w:tcPr>
-            <w:tcW w:type="dxa" w:w="2880"/>
-          </w:tcPr>
-          <w:p>
-            <w:r>
-              <w:t>Listar todas las tareas</w:t>
-            </w:r>
-          </w:p>
-        </w:tc>
-      </w:tr>
-      <w:tr>
-        <w:tc>
-          <w:tcPr>
-            <w:tcW w:type="dxa" w:w="2880"/>
-          </w:tcPr>
-          <w:p>
-            <w:r>
-              <w:t>GET</w:t>
-            </w:r>
-          </w:p>
-        </w:tc>
-        <w:tc>
-          <w:tcPr>
-            <w:tcW w:type="dxa" w:w="2880"/>
-          </w:tcPr>
-          <w:p>
-            <w:r>
-              <w:t>/api/tasks?filter=pending</w:t>
-            </w:r>
-          </w:p>
-        </w:tc>
-        <w:tc>
-          <w:tcPr>
-            <w:tcW w:type="dxa" w:w="2880"/>
-          </w:tcPr>
-          <w:p>
-            <w:r>
-              <w:t>Listar tareas pendientes</w:t>
-            </w:r>
-          </w:p>
-        </w:tc>
-      </w:tr>
-      <w:tr>
-        <w:tc>
-          <w:tcPr>
-            <w:tcW w:type="dxa" w:w="2880"/>
-          </w:tcPr>
-          <w:p>
-            <w:r>
-              <w:t>POST</w:t>
-            </w:r>
-          </w:p>
-        </w:tc>
-        <w:tc>
-          <w:tcPr>
-            <w:tcW w:type="dxa" w:w="2880"/>
-          </w:tcPr>
-          <w:p>
-            <w:r>
-              <w:t>/api/tasks</w:t>
-            </w:r>
-          </w:p>
-        </w:tc>
-        <w:tc>
-          <w:tcPr>
-            <w:tcW w:type="dxa" w:w="2880"/>
-          </w:tcPr>
-          <w:p>
-            <w:r>
-              <w:t>Crear nueva tarea</w:t>
-            </w:r>
-          </w:p>
-        </w:tc>
-      </w:tr>
-      <w:tr>
-        <w:tc>
-          <w:tcPr>
-            <w:tcW w:type="dxa" w:w="2880"/>
-          </w:tcPr>
-          <w:p>
-            <w:r>
-              <w:t>PATCH</w:t>
-            </w:r>
-          </w:p>
-        </w:tc>
-        <w:tc>
-          <w:tcPr>
-            <w:tcW w:type="dxa" w:w="2880"/>
-          </w:tcPr>
-          <w:p>
-            <w:r>
-              <w:t>/api/tasks/&lt;id&gt;/complete</w:t>
-            </w:r>
-          </w:p>
-        </w:tc>
-        <w:tc>
-          <w:tcPr>
-            <w:tcW w:type="dxa" w:w="2880"/>
-          </w:tcPr>
-          <w:p>
-            <w:r>
-              <w:t>Marcar como completada</w:t>
-            </w:r>
-          </w:p>
-        </w:tc>
-      </w:tr>
-      <w:tr>
-        <w:tc>
-          <w:tcPr>
-            <w:tcW w:type="dxa" w:w="2880"/>
-          </w:tcPr>
-          <w:p>
-            <w:r>
-              <w:t>DELETE</w:t>
-            </w:r>
-          </w:p>
-        </w:tc>
-        <w:tc>
-          <w:tcPr>
-            <w:tcW w:type="dxa" w:w="2880"/>
-          </w:tcPr>
-          <w:p>
-            <w:r>
-              <w:t>/api/tasks/&lt;id&gt;</w:t>
-            </w:r>
-          </w:p>
-        </w:tc>
-        <w:tc>
-          <w:tcPr>
-            <w:tcW w:type="dxa" w:w="2880"/>
-          </w:tcPr>
-          <w:p>
-            <w:r>
-              <w:t>Eliminar tarea</w:t>
-            </w:r>
-          </w:p>
-        </w:tc>
-      </w:tr>
-    </w:tbl>
-    <w:p>
-      <w:pPr>
-        <w:pStyle w:val="Heading2"/>
-      </w:pPr>
-      <w:r>
-        <w:t>Actividad 5: Pruebas de software</w:t>
-      </w:r>
-    </w:p>
-    <w:p>
-      <w:r>
-        <w:t>Se crearon 12 pruebas automatizadas (8 unitarias + 4 de integracion):</w:t>
-      </w:r>
-    </w:p>
-    <w:p>
-      <w:pPr>
-        <w:pStyle w:val="Heading3"/>
-      </w:pPr>
-      <w:r>
-        <w:t>Pruebas unitarias (backend/tests/test_task_service.py)</w:t>
+        <w:t>Agregar subtarea a lista existente</w:t>
       </w:r>
     </w:p>
     <w:p>
@@ -1178,7 +736,7 @@
         <w:pStyle w:val="ListBullet"/>
       </w:pPr>
       <w:r>
-        <w:t>test_create_task_with_valid_data - Verifica creacion correcta con datos validos.</w:t>
+        <w:t>Agregar subtarea a lista inexistente lanza error</w:t>
       </w:r>
     </w:p>
     <w:p>
@@ -1186,7 +744,7 @@
         <w:pStyle w:val="ListBullet"/>
       </w:pPr>
       <w:r>
-        <w:t>test_create_task_with_empty_title_raises_error - Titulo vacio lanza ValidationError.</w:t>
+        <w:t>Marcar subtarea como completada (toggle on)</w:t>
       </w:r>
     </w:p>
     <w:p>
@@ -1194,7 +752,7 @@
         <w:pStyle w:val="ListBullet"/>
       </w:pPr>
       <w:r>
-        <w:t>test_create_task_with_whitespace_title_raises_error - Titulo con solo espacios es rechazado.</w:t>
+        <w:t>Desmarcar subtarea completada (toggle off)</w:t>
       </w:r>
     </w:p>
     <w:p>
@@ -1202,7 +760,7 @@
         <w:pStyle w:val="ListBullet"/>
       </w:pPr>
       <w:r>
-        <w:t>test_create_task_with_long_title_raises_error - Titulo mayor a 200 caracteres es rechazado.</w:t>
+        <w:t>Toggle en subtarea inexistente lanza error</w:t>
       </w:r>
     </w:p>
     <w:p>
@@ -1210,7 +768,7 @@
         <w:pStyle w:val="ListBullet"/>
       </w:pPr>
       <w:r>
-        <w:t>test_complete_task_success - Completar tarea existente funciona correctamente.</w:t>
+        <w:t>Obtener todas las listas</w:t>
       </w:r>
     </w:p>
     <w:p>
@@ -1218,7 +776,7 @@
         <w:pStyle w:val="ListBullet"/>
       </w:pPr>
       <w:r>
-        <w:t>test_complete_nonexistent_task_raises_error - Completar tarea inexistente lanza error.</w:t>
+        <w:t>Progreso 0% sin subtareas</w:t>
       </w:r>
     </w:p>
     <w:p>
@@ -1226,7 +784,7 @@
         <w:pStyle w:val="ListBullet"/>
       </w:pPr>
       <w:r>
-        <w:t>test_delete_nonexistent_task_raises_error - Eliminar tarea inexistente lanza error.</w:t>
+        <w:t>Progreso 100% con todas completadas</w:t>
       </w:r>
     </w:p>
     <w:p>
@@ -1234,15 +792,13 @@
         <w:pStyle w:val="ListBullet"/>
       </w:pPr>
       <w:r>
-        <w:t>test_get_all_tasks - Obtener todas las tareas retorna lista correcta.</w:t>
+        <w:t>Progreso 25% con 1 de 4 completadas</w:t>
       </w:r>
     </w:p>
+    <w:p/>
     <w:p>
-      <w:pPr>
-        <w:pStyle w:val="Heading3"/>
-      </w:pPr>
       <w:r>
-        <w:t>Pruebas de integracion (tests/integration/test_api_integration.py)</w:t>
+        <w:t>Integracion (6):</w:t>
       </w:r>
     </w:p>
     <w:p>
@@ -1250,7 +806,7 @@
         <w:pStyle w:val="ListBullet"/>
       </w:pPr>
       <w:r>
-        <w:t>test_create_and_list_tasks - Flujo completo: crear tarea y verificar en listado.</w:t>
+        <w:t>Crear lista y verificar en listado</w:t>
       </w:r>
     </w:p>
     <w:p>
@@ -1258,7 +814,7 @@
         <w:pStyle w:val="ListBullet"/>
       </w:pPr>
       <w:r>
-        <w:t>test_create_task_without_title_returns_400 - Crear sin titulo retorna error 400.</w:t>
+        <w:t>Crear lista sin titulo da error 400</w:t>
       </w:r>
     </w:p>
     <w:p>
@@ -1266,7 +822,7 @@
         <w:pStyle w:val="ListBullet"/>
       </w:pPr>
       <w:r>
-        <w:t>test_complete_task_flow - Crear y luego completar una tarea.</w:t>
+        <w:t>Agregar subtareas y verificar progreso</w:t>
       </w:r>
     </w:p>
     <w:p>
@@ -1274,59 +830,43 @@
         <w:pStyle w:val="ListBullet"/>
       </w:pPr>
       <w:r>
-        <w:t>test_delete_nonexistent_task_returns_404 - Eliminar inexistente retorna 404.</w:t>
+        <w:t>Toggle: marcar y desmarcar una subtarea</w:t>
+      </w:r>
+    </w:p>
+    <w:p>
+      <w:pPr>
+        <w:pStyle w:val="ListBullet"/>
+      </w:pPr>
+      <w:r>
+        <w:t>Eliminar lista elimina sus subtareas (cascade)</w:t>
+      </w:r>
+    </w:p>
+    <w:p>
+      <w:pPr>
+        <w:pStyle w:val="ListBullet"/>
+      </w:pPr>
+      <w:r>
+        <w:t>Eliminar lista inexistente da error 404</w:t>
       </w:r>
     </w:p>
     <w:p/>
     <w:p>
       <w:r>
-        <w:rPr>
-          <w:b/>
-          <w:color w:val="008000"/>
-        </w:rPr>
-        <w:t>Resultado de ejecucion: 12 passed in 0.19s</w:t>
+        <w:t>Evidencia de ejecucion:</w:t>
       </w:r>
     </w:p>
-    <w:p/>
     <w:p>
       <w:r>
         <w:rPr>
           <w:rFonts w:ascii="Consolas" w:hAnsi="Consolas"/>
-          <w:sz w:val="14"/>
+          <w:sz w:val="18"/>
         </w:rPr>
         <w:t>$ python3 -m pytest -v</w:t>
         <w:br/>
-        <w:t>============================= test session starts ==============================</w:t>
-        <w:br/>
-        <w:t>platform linux -- Python 3.12.3, pytest-7.4.4</w:t>
+        <w:t>21 passed in 0.39s</w:t>
         <w:br/>
         <w:br/>
-        <w:t>backend/tests/test_task_service.py::TestTaskService::test_complete_nonexistent_task_raises_error PASSED [  8%]</w:t>
-        <w:br/>
-        <w:t>backend/tests/test_task_service.py::TestTaskService::test_complete_task_success PASSED [ 16%]</w:t>
-        <w:br/>
-        <w:t>backend/tests/test_task_service.py::TestTaskService::test_create_task_with_empty_title_raises_error PASSED [ 25%]</w:t>
-        <w:br/>
-        <w:t>backend/tests/test_task_service.py::TestTaskService::test_create_task_with_long_title_raises_error PASSED [ 33%]</w:t>
-        <w:br/>
-        <w:t>backend/tests/test_task_service.py::TestTaskService::test_create_task_with_valid_data PASSED [ 41%]</w:t>
-        <w:br/>
-        <w:t>backend/tests/test_task_service.py::TestTaskService::test_create_task_with_whitespace_title_raises_error PASSED [ 50%]</w:t>
-        <w:br/>
-        <w:t>backend/tests/test_task_service.py::TestTaskService::test_delete_nonexistent_task_raises_error PASSED [ 58%]</w:t>
-        <w:br/>
-        <w:t>backend/tests/test_task_service.py::TestTaskService::test_get_all_tasks PASSED [ 66%]</w:t>
-        <w:br/>
-        <w:t>tests/integration/test_api_integration.py::TestTaskAPIIntegration::test_complete_task_flow PASSED [ 75%]</w:t>
-        <w:br/>
-        <w:t>tests/integration/test_api_integration.py::TestTaskAPIIntegration::test_create_and_list_tasks PASSED [ 83%]</w:t>
-        <w:br/>
-        <w:t>tests/integration/test_api_integration.py::TestTaskAPIIntegration::test_create_task_without_title_returns_400 PASSED [ 91%]</w:t>
-        <w:br/>
-        <w:t>tests/integration/test_api_integration.py::TestTaskAPIIntegration::test_delete_nonexistent_task_returns_404 PASSED [100%]</w:t>
-        <w:br/>
-        <w:br/>
-        <w:t>============================== 12 passed in 0.19s ==============================</w:t>
+        <w:t>Todas las pruebas unitarias y de integracion pasaron correctamente.</w:t>
       </w:r>
     </w:p>
     <w:sectPr>

</xml_diff>

<commit_message>
ui: timeline con linea vertical y dots conectando subtareas al expandir
</commit_message>
<xml_diff>
--- a/Examen_Final_Respuestas.docx
+++ b/Examen_Final_Respuestas.docx
@@ -15,6 +15,7 @@
       <w:r>
         <w:rPr>
           <w:b/>
+          <w:color w:val="000000"/>
           <w:sz w:val="40"/>
         </w:rPr>
         <w:t>EXAMEN FINAL</w:t>
@@ -26,6 +27,7 @@
       </w:pPr>
       <w:r>
         <w:rPr>
+          <w:color w:val="000000"/>
           <w:sz w:val="28"/>
         </w:rPr>
         <w:t>Ingenieria de Software II</w:t>
@@ -45,7 +47,7 @@
         <w:jc w:val="center"/>
       </w:pPr>
       <w:r>
-        <w:t>Repositorio: github.com/tunek12421/project-exam-ingenieria-software</w:t>
+        <w:t>github.com/tunek12421/project-exam-ingenieria-software</w:t>
       </w:r>
     </w:p>
     <w:p>
@@ -74,17 +76,12 @@
         <w:pStyle w:val="Heading2"/>
       </w:pPr>
       <w:r>
-        <w:t>1. Diferencia entre arquitectura monolitica y por capas</w:t>
+        <w:t>1. Monolitica vs por capas</w:t>
       </w:r>
     </w:p>
     <w:p>
       <w:r>
-        <w:t>En la monolitica todo el sistema esta en un solo bloque: presentacion, logica y datos juntos. Cualquier cambio obliga a redesplegar todo.</w:t>
-      </w:r>
-    </w:p>
-    <w:p>
-      <w:r>
-        <w:t>En la arquitectura por capas se separa en niveles independientes (presentacion, negocio, datos). Cada capa tiene su responsabilidad y solo se comunica con la capa de al lado. Esto hace que sea mas facil de mantener y de probar.</w:t>
+        <w:t>La monolitica tiene todo junto en un solo bloque. La de capas separa en niveles (presentacion, negocio, datos), cada uno con su responsabilidad. Es mas facil de mantener y probar.</w:t>
       </w:r>
     </w:p>
     <w:p>
@@ -92,12 +89,12 @@
         <w:pStyle w:val="Heading2"/>
       </w:pPr>
       <w:r>
-        <w:t>2. Por que la refactorizacion no debe cambiar la funcionalidad</w:t>
+        <w:t>2. Refactorizacion y funcionalidad</w:t>
       </w:r>
     </w:p>
     <w:p>
       <w:r>
-        <w:t>Porque la idea es mejorar como esta escrito el codigo por dentro, no lo que hace. Si cambias el comportamiento ya no es refactorizacion, es otra cosa. Las pruebas que ya existian tienen que seguir pasando igual antes y despues.</w:t>
+        <w:t>La refactorizacion mejora la estructura del codigo sin cambiar lo que hace. Si cambia el comportamiento, ya no es refactorizacion. Las pruebas deben seguir pasando igual.</w:t>
       </w:r>
     </w:p>
     <w:p>
@@ -105,12 +102,12 @@
         <w:pStyle w:val="Heading2"/>
       </w:pPr>
       <w:r>
-        <w:t>3. Importancia de las pruebas automatizadas</w:t>
+        <w:t>3. Pruebas automatizadas</w:t>
       </w:r>
     </w:p>
     <w:p>
       <w:r>
-        <w:t>Permiten detectar errores rapido y de forma repetible sin tener que probar a mano cada vez. Cuando haces cambios en el codigo, las pruebas te avisan si rompiste algo que antes funcionaba. Tambien sirven como documentacion de como debe comportarse el sistema.</w:t>
+        <w:t>Detectan errores rapido y sin probar a mano. Cuando cambias algo, te avisan si rompiste algo. Sirven como documentacion del comportamiento esperado.</w:t>
       </w:r>
     </w:p>
     <w:p>
@@ -131,58 +128,17 @@
         <w:pStyle w:val="Heading2"/>
       </w:pPr>
       <w:r>
-        <w:t>Actividad 1 - Organizacion y control de versiones</w:t>
+        <w:t>Actividad 1 - Organizacion y versiones</w:t>
       </w:r>
     </w:p>
     <w:p>
       <w:r>
-        <w:t>Stack usado:</w:t>
+        <w:t>Python/Flask, HTML/CSS/JS, SQLite, pytest, Docker. Rama examen-enrique-lujan con 7 commits.</w:t>
       </w:r>
     </w:p>
     <w:p>
-      <w:pPr>
-        <w:pStyle w:val="ListBullet"/>
-      </w:pPr>
       <w:r>
-        <w:t>Backend: Python 3 + Flask</w:t>
-      </w:r>
-    </w:p>
-    <w:p>
-      <w:pPr>
-        <w:pStyle w:val="ListBullet"/>
-      </w:pPr>
-      <w:r>
-        <w:t>Frontend: HTML/CSS/JS</w:t>
-      </w:r>
-    </w:p>
-    <w:p>
-      <w:pPr>
-        <w:pStyle w:val="ListBullet"/>
-      </w:pPr>
-      <w:r>
-        <w:t>BD: SQLite</w:t>
-      </w:r>
-    </w:p>
-    <w:p>
-      <w:pPr>
-        <w:pStyle w:val="ListBullet"/>
-      </w:pPr>
-      <w:r>
-        <w:t>Tests: pytest</w:t>
-      </w:r>
-    </w:p>
-    <w:p>
-      <w:pPr>
-        <w:pStyle w:val="ListBullet"/>
-      </w:pPr>
-      <w:r>
-        <w:t>Docker + Docker Compose</w:t>
-      </w:r>
-    </w:p>
-    <w:p/>
-    <w:p>
-      <w:r>
-        <w:t>Estructura del proyecto:</w:t>
+        <w:t>Estructura:</w:t>
       </w:r>
     </w:p>
     <w:p>
@@ -191,62 +147,15 @@
           <w:rFonts w:ascii="Consolas" w:hAnsi="Consolas"/>
           <w:sz w:val="18"/>
         </w:rPr>
-        <w:t>project-exam/</w:t>
+        <w:t>backend/src/ -&gt; config, controllers, services, models, repositories</w:t>
         <w:br/>
-        <w:t xml:space="preserve">  backend/src/ -&gt; config, controllers, services, models, repositories</w:t>
+        <w:t>frontend/src/ -&gt; components, pages, services, assets</w:t>
         <w:br/>
-        <w:t xml:space="preserve">  backend/tests/ -&gt; pruebas unitarias</w:t>
+        <w:t>database/ -&gt; schema.sql, seed.sql</w:t>
         <w:br/>
-        <w:t xml:space="preserve">  frontend/src/ -&gt; components, pages, services, assets</w:t>
+        <w:t>tests/ -&gt; unitarias e integracion</w:t>
         <w:br/>
-        <w:t xml:space="preserve">  database/ -&gt; schema.sql, seed.sql</w:t>
-        <w:br/>
-        <w:t xml:space="preserve">  tests/integration/ -&gt; pruebas de integracion</w:t>
-        <w:br/>
-        <w:t xml:space="preserve">  docs/architecture.md</w:t>
-        <w:br/>
-        <w:t xml:space="preserve">  Dockerfile, docker-compose.yml, README.md</w:t>
-      </w:r>
-    </w:p>
-    <w:p/>
-    <w:p>
-      <w:r>
-        <w:t>Commits realizados en la rama examen-enrique-lujan:</w:t>
-      </w:r>
-    </w:p>
-    <w:p>
-      <w:r>
-        <w:t>1. feat: estructura base con modelo, repositorio y configuracion de BD</w:t>
-      </w:r>
-    </w:p>
-    <w:p>
-      <w:r>
-        <w:t>2. feat: implementacion de API REST y frontend</w:t>
-      </w:r>
-    </w:p>
-    <w:p>
-      <w:r>
-        <w:t>3. test: pruebas unitarias e integracion + documentacion</w:t>
-      </w:r>
-    </w:p>
-    <w:p>
-      <w:r>
-        <w:t>4. refactor: correccion de code smells</w:t>
-      </w:r>
-    </w:p>
-    <w:p>
-      <w:r>
-        <w:t>5. feat: dockerizacion con Dockerfile y docker-compose</w:t>
-      </w:r>
-    </w:p>
-    <w:p>
-      <w:r>
-        <w:t>6. docs: actualizacion del README</w:t>
-      </w:r>
-    </w:p>
-    <w:p>
-      <w:r>
-        <w:t>7. feat: rediseno con listas de tareas, subtareas y progreso circular</w:t>
+        <w:t>Dockerfile, docker-compose.yml, README.md</w:t>
       </w:r>
     </w:p>
     <w:p>
@@ -254,90 +163,17 @@
         <w:pStyle w:val="Heading2"/>
       </w:pPr>
       <w:r>
-        <w:t>Actividad 2 - Arquitectura del sistema</w:t>
+        <w:t>Actividad 2 - Arquitectura</w:t>
       </w:r>
     </w:p>
     <w:p>
       <w:r>
-        <w:t>El proyecto usa una arquitectura por capas. Cada parte tiene una responsabilidad clara:</w:t>
+        <w:t>Arquitectura por capas: Frontend -&gt; Controllers -&gt; Services -&gt; Repositories -&gt; BD. Cada capa con su responsabilidad. Modelos: TaskList y Subtask.</w:t>
       </w:r>
     </w:p>
     <w:p>
-      <w:pPr>
-        <w:pStyle w:val="ListBullet"/>
-      </w:pPr>
       <w:r>
-        <w:t>Frontend (HTML/JS) -&gt; lo que ve el usuario, consume la API</w:t>
-      </w:r>
-    </w:p>
-    <w:p>
-      <w:pPr>
-        <w:pStyle w:val="ListBullet"/>
-      </w:pPr>
-      <w:r>
-        <w:t>Controllers -&gt; reciben las peticiones HTTP y las pasan al servicio</w:t>
-      </w:r>
-    </w:p>
-    <w:p>
-      <w:pPr>
-        <w:pStyle w:val="ListBullet"/>
-      </w:pPr>
-      <w:r>
-        <w:t>Services -&gt; logica de negocio y validaciones</w:t>
-      </w:r>
-    </w:p>
-    <w:p>
-      <w:pPr>
-        <w:pStyle w:val="ListBullet"/>
-      </w:pPr>
-      <w:r>
-        <w:t>Repositories -&gt; consultas a la base de datos</w:t>
-      </w:r>
-    </w:p>
-    <w:p>
-      <w:pPr>
-        <w:pStyle w:val="ListBullet"/>
-      </w:pPr>
-      <w:r>
-        <w:t>Models -&gt; definen la estructura de los datos (TaskList, Subtask)</w:t>
-      </w:r>
-    </w:p>
-    <w:p/>
-    <w:p>
-      <w:r>
-        <w:t>Mejoras que se podrian hacer:</w:t>
-      </w:r>
-    </w:p>
-    <w:p>
-      <w:pPr>
-        <w:pStyle w:val="ListBullet"/>
-      </w:pPr>
-      <w:r>
-        <w:t>Usar un sistema de migraciones como Alembic en vez de schema.sql</w:t>
-      </w:r>
-    </w:p>
-    <w:p>
-      <w:pPr>
-        <w:pStyle w:val="ListBullet"/>
-      </w:pPr>
-      <w:r>
-        <w:t>Agregar autenticacion con JWT</w:t>
-      </w:r>
-    </w:p>
-    <w:p>
-      <w:pPr>
-        <w:pStyle w:val="ListBullet"/>
-      </w:pPr>
-      <w:r>
-        <w:t>Manejo centralizado de errores con un middleware</w:t>
-      </w:r>
-    </w:p>
-    <w:p>
-      <w:pPr>
-        <w:pStyle w:val="ListBullet"/>
-      </w:pPr>
-      <w:r>
-        <w:t>Migrar el frontend a un framework como Vue o React</w:t>
+        <w:t>Mejoras posibles: migraciones con Alembic, autenticacion JWT, middleware de errores, migrar frontend a Vue/React.</w:t>
       </w:r>
     </w:p>
     <w:p>
@@ -350,177 +186,71 @@
     </w:p>
     <w:p>
       <w:r>
-        <w:t>Problemas que encontre y como los corregi:</w:t>
-      </w:r>
-    </w:p>
-    <w:p/>
-    <w:p>
-      <w:r>
-        <w:rPr>
-          <w:b/>
-        </w:rPr>
-        <w:t xml:space="preserve">Problema: </w:t>
-      </w:r>
-      <w:r>
-        <w:t>Conexiones a la BD no se cerraban si habia error</w:t>
+        <w:t>Problemas encontrados y corregidos:</w:t>
       </w:r>
     </w:p>
     <w:p>
+      <w:pPr>
+        <w:pStyle w:val="ListBullet"/>
+      </w:pPr>
       <w:r>
-        <w:rPr>
-          <w:b/>
-        </w:rPr>
-        <w:t xml:space="preserve">Solucion: </w:t>
-      </w:r>
-      <w:r>
-        <w:t>Use context manager (with) para que siempre se cierre la conexion</w:t>
-      </w:r>
-    </w:p>
-    <w:p/>
-    <w:p>
-      <w:r>
-        <w:rPr>
-          <w:b/>
-        </w:rPr>
-        <w:t xml:space="preserve">Problema: </w:t>
-      </w:r>
-      <w:r>
-        <w:t>La misma query SQL repetida en 3 metodos</w:t>
+        <w:t>Conexiones a BD sin cierre seguro -&gt; context manager (with)</w:t>
       </w:r>
     </w:p>
     <w:p>
+      <w:pPr>
+        <w:pStyle w:val="ListBullet"/>
+      </w:pPr>
       <w:r>
-        <w:rPr>
-          <w:b/>
-        </w:rPr>
-        <w:t xml:space="preserve">Solucion: </w:t>
-      </w:r>
-      <w:r>
-        <w:t>La extraje a una constante _BASE_SELECT</w:t>
-      </w:r>
-    </w:p>
-    <w:p/>
-    <w:p>
-      <w:r>
-        <w:rPr>
-          <w:b/>
-        </w:rPr>
-        <w:t xml:space="preserve">Problema: </w:t>
-      </w:r>
-      <w:r>
-        <w:t>Import de datetime que no se usaba</w:t>
+        <w:t>Query SQL repetida 3 veces -&gt; constante _BASE_SELECT</w:t>
       </w:r>
     </w:p>
     <w:p>
+      <w:pPr>
+        <w:pStyle w:val="ListBullet"/>
+      </w:pPr>
       <w:r>
-        <w:rPr>
-          <w:b/>
-        </w:rPr>
-        <w:t xml:space="preserve">Solucion: </w:t>
-      </w:r>
-      <w:r>
-        <w:t>Lo elimine</w:t>
-      </w:r>
-    </w:p>
-    <w:p/>
-    <w:p>
-      <w:r>
-        <w:rPr>
-          <w:b/>
-        </w:rPr>
-        <w:t xml:space="preserve">Problema: </w:t>
-      </w:r>
-      <w:r>
-        <w:t>El numero 200 estaba puesto directo en el codigo</w:t>
+        <w:t>Import datetime sin usar -&gt; eliminado</w:t>
       </w:r>
     </w:p>
     <w:p>
+      <w:pPr>
+        <w:pStyle w:val="ListBullet"/>
+      </w:pPr>
       <w:r>
-        <w:rPr>
-          <w:b/>
-        </w:rPr>
-        <w:t xml:space="preserve">Solucion: </w:t>
-      </w:r>
-      <w:r>
-        <w:t>Lo movi a una constante TITLE_MAX_LENGTH en config</w:t>
-      </w:r>
-    </w:p>
-    <w:p/>
-    <w:p>
-      <w:r>
-        <w:rPr>
-          <w:b/>
-        </w:rPr>
-        <w:t xml:space="preserve">Problema: </w:t>
-      </w:r>
-      <w:r>
-        <w:t>La misma validacion de "tarea no encontrada" en dos metodos</w:t>
+        <w:t>Numero 200 directo en codigo -&gt; constante TITLE_MAX_LENGTH</w:t>
       </w:r>
     </w:p>
     <w:p>
+      <w:pPr>
+        <w:pStyle w:val="ListBullet"/>
+      </w:pPr>
       <w:r>
-        <w:rPr>
-          <w:b/>
-        </w:rPr>
-        <w:t xml:space="preserve">Solucion: </w:t>
-      </w:r>
-      <w:r>
-        <w:t>Cree un metodo reutilizable _find_list_or_raise()</w:t>
-      </w:r>
-    </w:p>
-    <w:p/>
-    <w:p>
-      <w:r>
-        <w:rPr>
-          <w:b/>
-        </w:rPr>
-        <w:t xml:space="preserve">Problema: </w:t>
-      </w:r>
-      <w:r>
-        <w:t>No habia validacion en el frontend antes de enviar datos</w:t>
+        <w:t>Validacion duplicada en servicio -&gt; metodo _find_list_or_raise()</w:t>
       </w:r>
     </w:p>
     <w:p>
+      <w:pPr>
+        <w:pStyle w:val="ListBullet"/>
+      </w:pPr>
       <w:r>
-        <w:rPr>
-          <w:b/>
-        </w:rPr>
-        <w:t xml:space="preserve">Solucion: </w:t>
-      </w:r>
-      <w:r>
-        <w:t>Agregue trim() y verificacion de campo vacio</w:t>
-      </w:r>
-    </w:p>
-    <w:p/>
-    <w:p>
-      <w:r>
-        <w:rPr>
-          <w:b/>
-        </w:rPr>
-        <w:t xml:space="preserve">Problema: </w:t>
-      </w:r>
-      <w:r>
-        <w:t>No habia aviso cuando algo salia bien</w:t>
+        <w:t>Sin validacion en frontend -&gt; trim() + check vacio</w:t>
       </w:r>
     </w:p>
     <w:p>
+      <w:pPr>
+        <w:pStyle w:val="ListBullet"/>
+      </w:pPr>
       <w:r>
-        <w:rPr>
-          <w:b/>
-        </w:rPr>
-        <w:t xml:space="preserve">Solucion: </w:t>
-      </w:r>
-      <w:r>
-        <w:t>Agregue notificaciones tipo toast</w:t>
+        <w:t>Sin aviso de exito -&gt; notificaciones toast</w:t>
       </w:r>
     </w:p>
-    <w:p/>
     <w:p>
       <w:pPr>
         <w:pStyle w:val="Heading2"/>
       </w:pPr>
       <w:r>
-        <w:t>Actividad 4 - Funcionalidad implementada</w:t>
+        <w:t>Actividad 4 - Funcionalidad</w:t>
       </w:r>
     </w:p>
     <w:p>
@@ -533,7 +263,7 @@
         <w:pStyle w:val="ListBullet"/>
       </w:pPr>
       <w:r>
-        <w:t>Crear listas de tareas con titulo y descripcion</w:t>
+        <w:t>Crear tareas con titulo y descripcion</w:t>
       </w:r>
     </w:p>
     <w:p>
@@ -541,7 +271,7 @@
         <w:pStyle w:val="ListBullet"/>
       </w:pPr>
       <w:r>
-        <w:t>Agregar subtareas dentro de cada lista</w:t>
+        <w:t>Agregar subtareas dentro de cada tarea</w:t>
       </w:r>
     </w:p>
     <w:p>
@@ -557,7 +287,7 @@
         <w:pStyle w:val="ListBullet"/>
       </w:pPr>
       <w:r>
-        <w:t>Ver el porcentaje de avance con un circulo de progreso</w:t>
+        <w:t>Circulo de progreso segun subtareas completadas</w:t>
       </w:r>
     </w:p>
     <w:p>
@@ -565,7 +295,7 @@
         <w:pStyle w:val="ListBullet"/>
       </w:pPr>
       <w:r>
-        <w:t>Expandir y colapsar las subtareas de cada lista</w:t>
+        <w:t>Expandir/colapsar subtareas</w:t>
       </w:r>
     </w:p>
     <w:p>
@@ -573,7 +303,7 @@
         <w:pStyle w:val="ListBullet"/>
       </w:pPr>
       <w:r>
-        <w:t>Eliminar listas y subtareas</w:t>
+        <w:t>Eliminar tareas y subtareas</w:t>
       </w:r>
     </w:p>
     <w:p>
@@ -581,79 +311,7 @@
         <w:pStyle w:val="ListBullet"/>
       </w:pPr>
       <w:r>
-        <w:t>Validacion de campos vacios en frontend y backend</w:t>
-      </w:r>
-    </w:p>
-    <w:p/>
-    <w:p>
-      <w:r>
-        <w:t>Endpoints de la API:</w:t>
-      </w:r>
-    </w:p>
-    <w:p>
-      <w:r>
-        <w:rPr>
-          <w:b/>
-        </w:rPr>
-        <w:t>GET /api/task-lists</w:t>
-      </w:r>
-      <w:r>
-        <w:t xml:space="preserve"> - Obtener todas las listas con subtareas</w:t>
-      </w:r>
-    </w:p>
-    <w:p>
-      <w:r>
-        <w:rPr>
-          <w:b/>
-        </w:rPr>
-        <w:t>POST /api/task-lists</w:t>
-      </w:r>
-      <w:r>
-        <w:t xml:space="preserve"> - Crear una lista nueva</w:t>
-      </w:r>
-    </w:p>
-    <w:p>
-      <w:r>
-        <w:rPr>
-          <w:b/>
-        </w:rPr>
-        <w:t>DELETE /api/task-lists/&lt;id&gt;</w:t>
-      </w:r>
-      <w:r>
-        <w:t xml:space="preserve"> - Eliminar una lista</w:t>
-      </w:r>
-    </w:p>
-    <w:p>
-      <w:r>
-        <w:rPr>
-          <w:b/>
-        </w:rPr>
-        <w:t>POST /api/task-lists/&lt;id&gt;/subtasks</w:t>
-      </w:r>
-      <w:r>
-        <w:t xml:space="preserve"> - Agregar subtarea a una lista</w:t>
-      </w:r>
-    </w:p>
-    <w:p>
-      <w:r>
-        <w:rPr>
-          <w:b/>
-        </w:rPr>
-        <w:t>PATCH /api/subtasks/&lt;id&gt;/toggle</w:t>
-      </w:r>
-      <w:r>
-        <w:t xml:space="preserve"> - Marcar o desmarcar subtarea</w:t>
-      </w:r>
-    </w:p>
-    <w:p>
-      <w:r>
-        <w:rPr>
-          <w:b/>
-        </w:rPr>
-        <w:t>DELETE /api/subtasks/&lt;id&gt;</w:t>
-      </w:r>
-      <w:r>
-        <w:t xml:space="preserve"> - Eliminar una subtarea</w:t>
+        <w:t>Validacion de campos vacios</w:t>
       </w:r>
     </w:p>
     <w:p>
@@ -666,195 +324,22 @@
     </w:p>
     <w:p>
       <w:r>
-        <w:t>Se crearon 21 pruebas automatizadas. Todas pasan.</w:t>
+        <w:t>21 pruebas (15 unitarias + 6 integracion). Todas pasan.</w:t>
       </w:r>
     </w:p>
     <w:p/>
     <w:p>
       <w:r>
-        <w:t>Unitarias (15):</w:t>
-      </w:r>
-    </w:p>
-    <w:p>
-      <w:pPr>
-        <w:pStyle w:val="ListBullet"/>
-      </w:pPr>
-      <w:r>
-        <w:t>Crear lista con datos validos</w:t>
-      </w:r>
-    </w:p>
-    <w:p>
-      <w:pPr>
-        <w:pStyle w:val="ListBullet"/>
-      </w:pPr>
-      <w:r>
-        <w:t>Titulo vacio lanza error</w:t>
-      </w:r>
-    </w:p>
-    <w:p>
-      <w:pPr>
-        <w:pStyle w:val="ListBullet"/>
-      </w:pPr>
-      <w:r>
-        <w:t>Titulo con solo espacios lanza error</w:t>
-      </w:r>
-    </w:p>
-    <w:p>
-      <w:pPr>
-        <w:pStyle w:val="ListBullet"/>
-      </w:pPr>
-      <w:r>
-        <w:t>Titulo muy largo lanza error</w:t>
-      </w:r>
-    </w:p>
-    <w:p>
-      <w:pPr>
-        <w:pStyle w:val="ListBullet"/>
-      </w:pPr>
-      <w:r>
-        <w:t>Eliminar lista existente</w:t>
-      </w:r>
-    </w:p>
-    <w:p>
-      <w:pPr>
-        <w:pStyle w:val="ListBullet"/>
-      </w:pPr>
-      <w:r>
-        <w:t>Eliminar lista inexistente lanza error</w:t>
-      </w:r>
-    </w:p>
-    <w:p>
-      <w:pPr>
-        <w:pStyle w:val="ListBullet"/>
-      </w:pPr>
-      <w:r>
-        <w:t>Agregar subtarea a lista existente</w:t>
-      </w:r>
-    </w:p>
-    <w:p>
-      <w:pPr>
-        <w:pStyle w:val="ListBullet"/>
-      </w:pPr>
-      <w:r>
-        <w:t>Agregar subtarea a lista inexistente lanza error</w:t>
-      </w:r>
-    </w:p>
-    <w:p>
-      <w:pPr>
-        <w:pStyle w:val="ListBullet"/>
-      </w:pPr>
-      <w:r>
-        <w:t>Marcar subtarea como completada (toggle on)</w:t>
-      </w:r>
-    </w:p>
-    <w:p>
-      <w:pPr>
-        <w:pStyle w:val="ListBullet"/>
-      </w:pPr>
-      <w:r>
-        <w:t>Desmarcar subtarea completada (toggle off)</w:t>
-      </w:r>
-    </w:p>
-    <w:p>
-      <w:pPr>
-        <w:pStyle w:val="ListBullet"/>
-      </w:pPr>
-      <w:r>
-        <w:t>Toggle en subtarea inexistente lanza error</w:t>
-      </w:r>
-    </w:p>
-    <w:p>
-      <w:pPr>
-        <w:pStyle w:val="ListBullet"/>
-      </w:pPr>
-      <w:r>
-        <w:t>Obtener todas las listas</w:t>
-      </w:r>
-    </w:p>
-    <w:p>
-      <w:pPr>
-        <w:pStyle w:val="ListBullet"/>
-      </w:pPr>
-      <w:r>
-        <w:t>Progreso 0% sin subtareas</w:t>
-      </w:r>
-    </w:p>
-    <w:p>
-      <w:pPr>
-        <w:pStyle w:val="ListBullet"/>
-      </w:pPr>
-      <w:r>
-        <w:t>Progreso 100% con todas completadas</w:t>
-      </w:r>
-    </w:p>
-    <w:p>
-      <w:pPr>
-        <w:pStyle w:val="ListBullet"/>
-      </w:pPr>
-      <w:r>
-        <w:t>Progreso 25% con 1 de 4 completadas</w:t>
+        <w:t>Unitarias: validaciones de titulo, CRUD listas, CRUD subtareas, toggle on/off, calculo de progreso (0%, 25%, 100%).</w:t>
       </w:r>
     </w:p>
     <w:p/>
     <w:p>
       <w:r>
-        <w:t>Integracion (6):</w:t>
-      </w:r>
-    </w:p>
-    <w:p>
-      <w:pPr>
-        <w:pStyle w:val="ListBullet"/>
-      </w:pPr>
-      <w:r>
-        <w:t>Crear lista y verificar en listado</w:t>
-      </w:r>
-    </w:p>
-    <w:p>
-      <w:pPr>
-        <w:pStyle w:val="ListBullet"/>
-      </w:pPr>
-      <w:r>
-        <w:t>Crear lista sin titulo da error 400</w:t>
-      </w:r>
-    </w:p>
-    <w:p>
-      <w:pPr>
-        <w:pStyle w:val="ListBullet"/>
-      </w:pPr>
-      <w:r>
-        <w:t>Agregar subtareas y verificar progreso</w:t>
-      </w:r>
-    </w:p>
-    <w:p>
-      <w:pPr>
-        <w:pStyle w:val="ListBullet"/>
-      </w:pPr>
-      <w:r>
-        <w:t>Toggle: marcar y desmarcar una subtarea</w:t>
-      </w:r>
-    </w:p>
-    <w:p>
-      <w:pPr>
-        <w:pStyle w:val="ListBullet"/>
-      </w:pPr>
-      <w:r>
-        <w:t>Eliminar lista elimina sus subtareas (cascade)</w:t>
-      </w:r>
-    </w:p>
-    <w:p>
-      <w:pPr>
-        <w:pStyle w:val="ListBullet"/>
-      </w:pPr>
-      <w:r>
-        <w:t>Eliminar lista inexistente da error 404</w:t>
+        <w:t>Integracion: crear y listar, error 400 sin titulo, progreso con subtareas, toggle check/uncheck, cascade delete, error 404.</w:t>
       </w:r>
     </w:p>
     <w:p/>
-    <w:p>
-      <w:r>
-        <w:t>Evidencia de ejecucion:</w:t>
-      </w:r>
-    </w:p>
     <w:p>
       <w:r>
         <w:rPr>
@@ -864,9 +349,6 @@
         <w:t>$ python3 -m pytest -v</w:t>
         <w:br/>
         <w:t>21 passed in 0.39s</w:t>
-        <w:br/>
-        <w:br/>
-        <w:t>Todas las pruebas unitarias y de integracion pasaron correctamente.</w:t>
       </w:r>
     </w:p>
     <w:sectPr>
@@ -1244,6 +726,7 @@
     <w:rsid w:val="00FC693F"/>
     <w:rPr>
       <w:rFonts w:ascii="Arial" w:hAnsi="Arial"/>
+      <w:color w:val="000000"/>
       <w:sz w:val="22"/>
     </w:rPr>
   </w:style>
@@ -1306,10 +789,10 @@
       <w:outlineLvl w:val="0"/>
     </w:pPr>
     <w:rPr>
-      <w:rFonts w:asciiTheme="majorHAnsi" w:eastAsiaTheme="majorEastAsia" w:hAnsiTheme="majorHAnsi" w:cstheme="majorBidi"/>
+      <w:rFonts w:asciiTheme="majorHAnsi" w:eastAsiaTheme="majorEastAsia" w:hAnsiTheme="majorHAnsi" w:cstheme="majorBidi" w:ascii="Arial" w:hAnsi="Arial"/>
       <w:b/>
       <w:bCs/>
-      <w:color w:val="365F91" w:themeColor="accent1" w:themeShade="BF"/>
+      <w:color w:val="000000"/>
       <w:sz w:val="28"/>
       <w:szCs w:val="28"/>
     </w:rPr>
@@ -1330,10 +813,10 @@
       <w:outlineLvl w:val="1"/>
     </w:pPr>
     <w:rPr>
-      <w:rFonts w:asciiTheme="majorHAnsi" w:eastAsiaTheme="majorEastAsia" w:hAnsiTheme="majorHAnsi" w:cstheme="majorBidi"/>
+      <w:rFonts w:asciiTheme="majorHAnsi" w:eastAsiaTheme="majorEastAsia" w:hAnsiTheme="majorHAnsi" w:cstheme="majorBidi" w:ascii="Arial" w:hAnsi="Arial"/>
       <w:b/>
       <w:bCs/>
-      <w:color w:val="4F81BD" w:themeColor="accent1"/>
+      <w:color w:val="000000"/>
       <w:sz w:val="26"/>
       <w:szCs w:val="26"/>
     </w:rPr>
@@ -1354,10 +837,10 @@
       <w:outlineLvl w:val="2"/>
     </w:pPr>
     <w:rPr>
-      <w:rFonts w:asciiTheme="majorHAnsi" w:eastAsiaTheme="majorEastAsia" w:hAnsiTheme="majorHAnsi" w:cstheme="majorBidi"/>
+      <w:rFonts w:asciiTheme="majorHAnsi" w:eastAsiaTheme="majorEastAsia" w:hAnsiTheme="majorHAnsi" w:cstheme="majorBidi" w:ascii="Arial" w:hAnsi="Arial"/>
       <w:b/>
       <w:bCs/>
-      <w:color w:val="4F81BD" w:themeColor="accent1"/>
+      <w:color w:val="000000"/>
     </w:rPr>
   </w:style>
   <w:style w:type="paragraph" w:styleId="Heading4">

</xml_diff>

<commit_message>
docs: actualizar README y documento de respuestas con todos los cambios
</commit_message>
<xml_diff>
--- a/Examen_Final_Respuestas.docx
+++ b/Examen_Final_Respuestas.docx
@@ -94,7 +94,7 @@
     </w:p>
     <w:p>
       <w:r>
-        <w:t>La refactorizacion mejora la estructura del codigo sin cambiar lo que hace. Si cambia el comportamiento, ya no es refactorizacion. Las pruebas deben seguir pasando igual.</w:t>
+        <w:t>La refactorizacion mejora la estructura del codigo sin cambiar lo que hace. Si cambia el comportamiento ya no es refactorizacion. Las pruebas deben seguir pasando igual.</w:t>
       </w:r>
     </w:p>
     <w:p>
@@ -133,7 +133,7 @@
     </w:p>
     <w:p>
       <w:r>
-        <w:t>Python/Flask, HTML/CSS/JS, SQLite, pytest, Docker. Rama examen-enrique-lujan con 7 commits.</w:t>
+        <w:t>Python/Flask, HTML/CSS/JS, SQLite, pytest, Docker. Rama examen-enrique-lujan con 11 commits.</w:t>
       </w:r>
     </w:p>
     <w:p>
@@ -151,11 +151,72 @@
         <w:br/>
         <w:t>frontend/src/ -&gt; components, pages, services, assets</w:t>
         <w:br/>
-        <w:t>database/ -&gt; schema.sql, seed.sql</w:t>
+        <w:t>database/ -&gt; schema.sql (task_lists + subtasks), seed.sql</w:t>
         <w:br/>
-        <w:t>tests/ -&gt; unitarias e integracion</w:t>
+        <w:t>tests/ -&gt; unitarias (15) e integracion (6)</w:t>
         <w:br/>
         <w:t>Dockerfile, docker-compose.yml, README.md</w:t>
+      </w:r>
+    </w:p>
+    <w:p/>
+    <w:p>
+      <w:r>
+        <w:t>Commits principales:</w:t>
+      </w:r>
+    </w:p>
+    <w:p>
+      <w:r>
+        <w:t>1. feat: estructura base con modelo, repositorio y BD</w:t>
+      </w:r>
+    </w:p>
+    <w:p>
+      <w:r>
+        <w:t>2. feat: API REST y frontend</w:t>
+      </w:r>
+    </w:p>
+    <w:p>
+      <w:r>
+        <w:t>3. test: pruebas unitarias e integracion</w:t>
+      </w:r>
+    </w:p>
+    <w:p>
+      <w:r>
+        <w:t>4. refactor: correccion de code smells</w:t>
+      </w:r>
+    </w:p>
+    <w:p>
+      <w:r>
+        <w:t>5. feat: dockerizacion</w:t>
+      </w:r>
+    </w:p>
+    <w:p>
+      <w:r>
+        <w:t>6. feat: rediseno con listas, subtareas y progreso circular</w:t>
+      </w:r>
+    </w:p>
+    <w:p>
+      <w:r>
+        <w:t>7. fix: manejo de requests sin JSON valido</w:t>
+      </w:r>
+    </w:p>
+    <w:p>
+      <w:r>
+        <w:t>8. ui: timeline con linea vertical y dots</w:t>
+      </w:r>
+    </w:p>
+    <w:p>
+      <w:r>
+        <w:t>9. fix: preservar paneles expandidos al toggle</w:t>
+      </w:r>
+    </w:p>
+    <w:p>
+      <w:r>
+        <w:t>10. ui: cerrar formulario de subtarea al agregar</w:t>
+      </w:r>
+    </w:p>
+    <w:p>
+      <w:r>
+        <w:t>11. docs: actualizacion README y documento de respuestas</w:t>
       </w:r>
     </w:p>
     <w:p>
@@ -168,12 +229,12 @@
     </w:p>
     <w:p>
       <w:r>
-        <w:t>Arquitectura por capas: Frontend -&gt; Controllers -&gt; Services -&gt; Repositories -&gt; BD. Cada capa con su responsabilidad. Modelos: TaskList y Subtask.</w:t>
+        <w:t>Arquitectura por capas: Frontend -&gt; Controllers -&gt; Services -&gt; Repositories -&gt; SQLite. Modelos: TaskList (con progreso calculado) y Subtask.</w:t>
       </w:r>
     </w:p>
     <w:p>
       <w:r>
-        <w:t>Mejoras posibles: migraciones con Alembic, autenticacion JWT, middleware de errores, migrar frontend a Vue/React.</w:t>
+        <w:t>Mejoras posibles: migraciones Alembic, autenticacion JWT, middleware de errores, migrar frontend a Vue/React.</w:t>
       </w:r>
     </w:p>
     <w:p>
@@ -194,7 +255,7 @@
         <w:pStyle w:val="ListBullet"/>
       </w:pPr>
       <w:r>
-        <w:t>Conexiones a BD sin cierre seguro -&gt; context manager (with)</w:t>
+        <w:t>Conexiones BD sin cierre seguro -&gt; context manager (with)</w:t>
       </w:r>
     </w:p>
     <w:p>
@@ -218,7 +279,7 @@
         <w:pStyle w:val="ListBullet"/>
       </w:pPr>
       <w:r>
-        <w:t>Numero 200 directo en codigo -&gt; constante TITLE_MAX_LENGTH</w:t>
+        <w:t>Numero 200 hardcodeado -&gt; constante TITLE_MAX_LENGTH</w:t>
       </w:r>
     </w:p>
     <w:p>
@@ -226,7 +287,7 @@
         <w:pStyle w:val="ListBullet"/>
       </w:pPr>
       <w:r>
-        <w:t>Validacion duplicada en servicio -&gt; metodo _find_list_or_raise()</w:t>
+        <w:t>Validacion duplicada en service -&gt; metodo _find_list_or_raise()</w:t>
       </w:r>
     </w:p>
     <w:p>
@@ -243,6 +304,22 @@
       </w:pPr>
       <w:r>
         <w:t>Sin aviso de exito -&gt; notificaciones toast</w:t>
+      </w:r>
+    </w:p>
+    <w:p>
+      <w:pPr>
+        <w:pStyle w:val="ListBullet"/>
+      </w:pPr>
+      <w:r>
+        <w:t>Paneles se cerraban al toggle -&gt; estado preservado con Set</w:t>
+      </w:r>
+    </w:p>
+    <w:p>
+      <w:pPr>
+        <w:pStyle w:val="ListBullet"/>
+      </w:pPr>
+      <w:r>
+        <w:t>Request sin JSON daba error 415 -&gt; get_json(silent=True) retorna 400</w:t>
       </w:r>
     </w:p>
     <w:p>
@@ -271,7 +348,7 @@
         <w:pStyle w:val="ListBullet"/>
       </w:pPr>
       <w:r>
-        <w:t>Agregar subtareas dentro de cada tarea</w:t>
+        <w:t>Agregar subtareas dentro de cada tarea (checklist)</w:t>
       </w:r>
     </w:p>
     <w:p>
@@ -295,7 +372,7 @@
         <w:pStyle w:val="ListBullet"/>
       </w:pPr>
       <w:r>
-        <w:t>Expandir/colapsar subtareas</w:t>
+        <w:t>Expandir/colapsar subtareas con timeline (linea + dots)</w:t>
       </w:r>
     </w:p>
     <w:p>
@@ -303,7 +380,7 @@
         <w:pStyle w:val="ListBullet"/>
       </w:pPr>
       <w:r>
-        <w:t>Eliminar tareas y subtareas</w:t>
+        <w:t>Eliminar tareas (cascade) y subtareas</w:t>
       </w:r>
     </w:p>
     <w:p>
@@ -311,7 +388,69 @@
         <w:pStyle w:val="ListBullet"/>
       </w:pPr>
       <w:r>
-        <w:t>Validacion de campos vacios</w:t>
+        <w:t>Validacion de campos vacios (front y back)</w:t>
+      </w:r>
+    </w:p>
+    <w:p>
+      <w:pPr>
+        <w:pStyle w:val="ListBullet"/>
+      </w:pPr>
+      <w:r>
+        <w:t>Paneles se mantienen abiertos al interactuar</w:t>
+      </w:r>
+    </w:p>
+    <w:p/>
+    <w:p>
+      <w:r>
+        <w:t>Endpoints:</w:t>
+      </w:r>
+    </w:p>
+    <w:p>
+      <w:pPr>
+        <w:pStyle w:val="ListBullet"/>
+      </w:pPr>
+      <w:r>
+        <w:t>GET /api/task-lists - Listar tareas con subtareas y progreso</w:t>
+      </w:r>
+    </w:p>
+    <w:p>
+      <w:pPr>
+        <w:pStyle w:val="ListBullet"/>
+      </w:pPr>
+      <w:r>
+        <w:t>POST /api/task-lists - Crear tarea</w:t>
+      </w:r>
+    </w:p>
+    <w:p>
+      <w:pPr>
+        <w:pStyle w:val="ListBullet"/>
+      </w:pPr>
+      <w:r>
+        <w:t>DELETE /api/task-lists/&lt;id&gt; - Eliminar tarea (cascade)</w:t>
+      </w:r>
+    </w:p>
+    <w:p>
+      <w:pPr>
+        <w:pStyle w:val="ListBullet"/>
+      </w:pPr>
+      <w:r>
+        <w:t>POST /api/task-lists/&lt;id&gt;/subtasks - Agregar subtarea</w:t>
+      </w:r>
+    </w:p>
+    <w:p>
+      <w:pPr>
+        <w:pStyle w:val="ListBullet"/>
+      </w:pPr>
+      <w:r>
+        <w:t>PATCH /api/subtasks/&lt;id&gt;/toggle - Marcar/desmarcar subtarea</w:t>
+      </w:r>
+    </w:p>
+    <w:p>
+      <w:pPr>
+        <w:pStyle w:val="ListBullet"/>
+      </w:pPr>
+      <w:r>
+        <w:t>DELETE /api/subtasks/&lt;id&gt; - Eliminar subtarea</w:t>
       </w:r>
     </w:p>
     <w:p>
@@ -330,7 +469,7 @@
     <w:p/>
     <w:p>
       <w:r>
-        <w:t>Unitarias: validaciones de titulo, CRUD listas, CRUD subtareas, toggle on/off, calculo de progreso (0%, 25%, 100%).</w:t>
+        <w:t>Unitarias: crear lista, titulo vacio/espacios/largo, eliminar lista, agregar subtarea, toggle on/off, subtarea inexistente, obtener listas, progreso 0%/25%/100%.</w:t>
       </w:r>
     </w:p>
     <w:p/>

</xml_diff>

<commit_message>
docs: agregar capturas del sistema al informe de respuestas
</commit_message>
<xml_diff>
--- a/Examen_Final_Respuestas.docx
+++ b/Examen_Final_Respuestas.docx
@@ -490,6 +490,244 @@
         <w:t>21 passed in 0.39s</w:t>
       </w:r>
     </w:p>
+    <w:p>
+      <w:r>
+        <w:br w:type="page"/>
+      </w:r>
+    </w:p>
+    <w:p>
+      <w:pPr>
+        <w:pStyle w:val="Heading1"/>
+      </w:pPr>
+      <w:r>
+        <w:t>Capturas del sistema</w:t>
+      </w:r>
+    </w:p>
+    <w:p>
+      <w:r>
+        <w:t>Vista principal con listas de tareas y progreso</w:t>
+      </w:r>
+    </w:p>
+    <w:p>
+      <w:pPr>
+        <w:jc w:val="center"/>
+      </w:pPr>
+      <w:r>
+        <w:drawing>
+          <wp:inline xmlns:a="http://schemas.openxmlformats.org/drawingml/2006/main" xmlns:pic="http://schemas.openxmlformats.org/drawingml/2006/picture">
+            <wp:extent cx="4114800" cy="3415497"/>
+            <wp:docPr id="1" name="Picture 1"/>
+            <wp:cNvGraphicFramePr>
+              <a:graphicFrameLocks noChangeAspect="1"/>
+            </wp:cNvGraphicFramePr>
+            <a:graphic>
+              <a:graphicData uri="http://schemas.openxmlformats.org/drawingml/2006/picture">
+                <pic:pic>
+                  <pic:nvPicPr>
+                    <pic:cNvPr id="0" name="2.png"/>
+                    <pic:cNvPicPr/>
+                  </pic:nvPicPr>
+                  <pic:blipFill>
+                    <a:blip r:embed="rId9"/>
+                    <a:stretch>
+                      <a:fillRect/>
+                    </a:stretch>
+                  </pic:blipFill>
+                  <pic:spPr>
+                    <a:xfrm>
+                      <a:off x="0" y="0"/>
+                      <a:ext cx="4114800" cy="3415497"/>
+                    </a:xfrm>
+                    <a:prstGeom prst="rect"/>
+                  </pic:spPr>
+                </pic:pic>
+              </a:graphicData>
+            </a:graphic>
+          </wp:inline>
+        </w:drawing>
+      </w:r>
+    </w:p>
+    <w:p/>
+    <w:p>
+      <w:r>
+        <w:t>Formulario para crear nueva tarea</w:t>
+      </w:r>
+    </w:p>
+    <w:p>
+      <w:pPr>
+        <w:jc w:val="center"/>
+      </w:pPr>
+      <w:r>
+        <w:drawing>
+          <wp:inline xmlns:a="http://schemas.openxmlformats.org/drawingml/2006/main" xmlns:pic="http://schemas.openxmlformats.org/drawingml/2006/picture">
+            <wp:extent cx="4114800" cy="3415497"/>
+            <wp:docPr id="2" name="Picture 2"/>
+            <wp:cNvGraphicFramePr>
+              <a:graphicFrameLocks noChangeAspect="1"/>
+            </wp:cNvGraphicFramePr>
+            <a:graphic>
+              <a:graphicData uri="http://schemas.openxmlformats.org/drawingml/2006/picture">
+                <pic:pic>
+                  <pic:nvPicPr>
+                    <pic:cNvPr id="0" name="3.png"/>
+                    <pic:cNvPicPr/>
+                  </pic:nvPicPr>
+                  <pic:blipFill>
+                    <a:blip r:embed="rId10"/>
+                    <a:stretch>
+                      <a:fillRect/>
+                    </a:stretch>
+                  </pic:blipFill>
+                  <pic:spPr>
+                    <a:xfrm>
+                      <a:off x="0" y="0"/>
+                      <a:ext cx="4114800" cy="3415497"/>
+                    </a:xfrm>
+                    <a:prstGeom prst="rect"/>
+                  </pic:spPr>
+                </pic:pic>
+              </a:graphicData>
+            </a:graphic>
+          </wp:inline>
+        </w:drawing>
+      </w:r>
+    </w:p>
+    <w:p/>
+    <w:p>
+      <w:r>
+        <w:t>Validacion de campo obligatorio</w:t>
+      </w:r>
+    </w:p>
+    <w:p>
+      <w:pPr>
+        <w:jc w:val="center"/>
+      </w:pPr>
+      <w:r>
+        <w:drawing>
+          <wp:inline xmlns:a="http://schemas.openxmlformats.org/drawingml/2006/main" xmlns:pic="http://schemas.openxmlformats.org/drawingml/2006/picture">
+            <wp:extent cx="4114800" cy="3415497"/>
+            <wp:docPr id="3" name="Picture 3"/>
+            <wp:cNvGraphicFramePr>
+              <a:graphicFrameLocks noChangeAspect="1"/>
+            </wp:cNvGraphicFramePr>
+            <a:graphic>
+              <a:graphicData uri="http://schemas.openxmlformats.org/drawingml/2006/picture">
+                <pic:pic>
+                  <pic:nvPicPr>
+                    <pic:cNvPr id="0" name="4.png"/>
+                    <pic:cNvPicPr/>
+                  </pic:nvPicPr>
+                  <pic:blipFill>
+                    <a:blip r:embed="rId11"/>
+                    <a:stretch>
+                      <a:fillRect/>
+                    </a:stretch>
+                  </pic:blipFill>
+                  <pic:spPr>
+                    <a:xfrm>
+                      <a:off x="0" y="0"/>
+                      <a:ext cx="4114800" cy="3415497"/>
+                    </a:xfrm>
+                    <a:prstGeom prst="rect"/>
+                  </pic:spPr>
+                </pic:pic>
+              </a:graphicData>
+            </a:graphic>
+          </wp:inline>
+        </w:drawing>
+      </w:r>
+    </w:p>
+    <w:p/>
+    <w:p>
+      <w:r>
+        <w:t>Agregar subtarea a una tarea</w:t>
+      </w:r>
+    </w:p>
+    <w:p>
+      <w:pPr>
+        <w:jc w:val="center"/>
+      </w:pPr>
+      <w:r>
+        <w:drawing>
+          <wp:inline xmlns:a="http://schemas.openxmlformats.org/drawingml/2006/main" xmlns:pic="http://schemas.openxmlformats.org/drawingml/2006/picture">
+            <wp:extent cx="4114800" cy="3415497"/>
+            <wp:docPr id="4" name="Picture 4"/>
+            <wp:cNvGraphicFramePr>
+              <a:graphicFrameLocks noChangeAspect="1"/>
+            </wp:cNvGraphicFramePr>
+            <a:graphic>
+              <a:graphicData uri="http://schemas.openxmlformats.org/drawingml/2006/picture">
+                <pic:pic>
+                  <pic:nvPicPr>
+                    <pic:cNvPr id="0" name="5.png"/>
+                    <pic:cNvPicPr/>
+                  </pic:nvPicPr>
+                  <pic:blipFill>
+                    <a:blip r:embed="rId12"/>
+                    <a:stretch>
+                      <a:fillRect/>
+                    </a:stretch>
+                  </pic:blipFill>
+                  <pic:spPr>
+                    <a:xfrm>
+                      <a:off x="0" y="0"/>
+                      <a:ext cx="4114800" cy="3415497"/>
+                    </a:xfrm>
+                    <a:prstGeom prst="rect"/>
+                  </pic:spPr>
+                </pic:pic>
+              </a:graphicData>
+            </a:graphic>
+          </wp:inline>
+        </w:drawing>
+      </w:r>
+    </w:p>
+    <w:p/>
+    <w:p>
+      <w:r>
+        <w:t>Subtareas expandidas con timeline y checklist</w:t>
+      </w:r>
+    </w:p>
+    <w:p>
+      <w:pPr>
+        <w:jc w:val="center"/>
+      </w:pPr>
+      <w:r>
+        <w:drawing>
+          <wp:inline xmlns:a="http://schemas.openxmlformats.org/drawingml/2006/main" xmlns:pic="http://schemas.openxmlformats.org/drawingml/2006/picture">
+            <wp:extent cx="4114800" cy="3861648"/>
+            <wp:docPr id="5" name="Picture 5"/>
+            <wp:cNvGraphicFramePr>
+              <a:graphicFrameLocks noChangeAspect="1"/>
+            </wp:cNvGraphicFramePr>
+            <a:graphic>
+              <a:graphicData uri="http://schemas.openxmlformats.org/drawingml/2006/picture">
+                <pic:pic>
+                  <pic:nvPicPr>
+                    <pic:cNvPr id="0" name="6.png"/>
+                    <pic:cNvPicPr/>
+                  </pic:nvPicPr>
+                  <pic:blipFill>
+                    <a:blip r:embed="rId13"/>
+                    <a:stretch>
+                      <a:fillRect/>
+                    </a:stretch>
+                  </pic:blipFill>
+                  <pic:spPr>
+                    <a:xfrm>
+                      <a:off x="0" y="0"/>
+                      <a:ext cx="4114800" cy="3861648"/>
+                    </a:xfrm>
+                    <a:prstGeom prst="rect"/>
+                  </pic:spPr>
+                </pic:pic>
+              </a:graphicData>
+            </a:graphic>
+          </wp:inline>
+        </w:drawing>
+      </w:r>
+    </w:p>
+    <w:p/>
     <w:sectPr>
       <w:pgSz w:w="12240" w:h="15840"/>
       <w:pgMar w:top="1440" w:right="1800" w:bottom="1440" w:left="1800" w:header="720" w:footer="720" w:gutter="0"/>

</xml_diff>

<commit_message>
docs: agregar capturas de tests, git log, docker y estructura al informe
</commit_message>
<xml_diff>
--- a/Examen_Final_Respuestas.docx
+++ b/Examen_Final_Respuestas.docx
@@ -728,6 +728,244 @@
       </w:r>
     </w:p>
     <w:p/>
+    <w:p>
+      <w:r>
+        <w:br w:type="page"/>
+      </w:r>
+    </w:p>
+    <w:p>
+      <w:pPr>
+        <w:pStyle w:val="Heading1"/>
+      </w:pPr>
+      <w:r>
+        <w:t>Evidencia de pruebas y entorno</w:t>
+      </w:r>
+    </w:p>
+    <w:p>
+      <w:r>
+        <w:t>Ejecucion de pruebas - 21 passed</w:t>
+      </w:r>
+    </w:p>
+    <w:p>
+      <w:pPr>
+        <w:jc w:val="center"/>
+      </w:pPr>
+      <w:r>
+        <w:drawing>
+          <wp:inline xmlns:a="http://schemas.openxmlformats.org/drawingml/2006/main" xmlns:pic="http://schemas.openxmlformats.org/drawingml/2006/picture">
+            <wp:extent cx="5029200" cy="2805809"/>
+            <wp:docPr id="6" name="Picture 6"/>
+            <wp:cNvGraphicFramePr>
+              <a:graphicFrameLocks noChangeAspect="1"/>
+            </wp:cNvGraphicFramePr>
+            <a:graphic>
+              <a:graphicData uri="http://schemas.openxmlformats.org/drawingml/2006/picture">
+                <pic:pic>
+                  <pic:nvPicPr>
+                    <pic:cNvPr id="0" name="tests.png"/>
+                    <pic:cNvPicPr/>
+                  </pic:nvPicPr>
+                  <pic:blipFill>
+                    <a:blip r:embed="rId14"/>
+                    <a:stretch>
+                      <a:fillRect/>
+                    </a:stretch>
+                  </pic:blipFill>
+                  <pic:spPr>
+                    <a:xfrm>
+                      <a:off x="0" y="0"/>
+                      <a:ext cx="5029200" cy="2805809"/>
+                    </a:xfrm>
+                    <a:prstGeom prst="rect"/>
+                  </pic:spPr>
+                </pic:pic>
+              </a:graphicData>
+            </a:graphic>
+          </wp:inline>
+        </w:drawing>
+      </w:r>
+    </w:p>
+    <w:p/>
+    <w:p>
+      <w:r>
+        <w:t>Historial de commits</w:t>
+      </w:r>
+    </w:p>
+    <w:p>
+      <w:pPr>
+        <w:jc w:val="center"/>
+      </w:pPr>
+      <w:r>
+        <w:drawing>
+          <wp:inline xmlns:a="http://schemas.openxmlformats.org/drawingml/2006/main" xmlns:pic="http://schemas.openxmlformats.org/drawingml/2006/picture">
+            <wp:extent cx="5029200" cy="1445417"/>
+            <wp:docPr id="7" name="Picture 7"/>
+            <wp:cNvGraphicFramePr>
+              <a:graphicFrameLocks noChangeAspect="1"/>
+            </wp:cNvGraphicFramePr>
+            <a:graphic>
+              <a:graphicData uri="http://schemas.openxmlformats.org/drawingml/2006/picture">
+                <pic:pic>
+                  <pic:nvPicPr>
+                    <pic:cNvPr id="0" name="git_log.png"/>
+                    <pic:cNvPicPr/>
+                  </pic:nvPicPr>
+                  <pic:blipFill>
+                    <a:blip r:embed="rId15"/>
+                    <a:stretch>
+                      <a:fillRect/>
+                    </a:stretch>
+                  </pic:blipFill>
+                  <pic:spPr>
+                    <a:xfrm>
+                      <a:off x="0" y="0"/>
+                      <a:ext cx="5029200" cy="1445417"/>
+                    </a:xfrm>
+                    <a:prstGeom prst="rect"/>
+                  </pic:spPr>
+                </pic:pic>
+              </a:graphicData>
+            </a:graphic>
+          </wp:inline>
+        </w:drawing>
+      </w:r>
+    </w:p>
+    <w:p/>
+    <w:p>
+      <w:r>
+        <w:t>Rama de trabajo</w:t>
+      </w:r>
+    </w:p>
+    <w:p>
+      <w:pPr>
+        <w:jc w:val="center"/>
+      </w:pPr>
+      <w:r>
+        <w:drawing>
+          <wp:inline xmlns:a="http://schemas.openxmlformats.org/drawingml/2006/main" xmlns:pic="http://schemas.openxmlformats.org/drawingml/2006/picture">
+            <wp:extent cx="5029200" cy="1005840"/>
+            <wp:docPr id="8" name="Picture 8"/>
+            <wp:cNvGraphicFramePr>
+              <a:graphicFrameLocks noChangeAspect="1"/>
+            </wp:cNvGraphicFramePr>
+            <a:graphic>
+              <a:graphicData uri="http://schemas.openxmlformats.org/drawingml/2006/picture">
+                <pic:pic>
+                  <pic:nvPicPr>
+                    <pic:cNvPr id="0" name="git_branch.png"/>
+                    <pic:cNvPicPr/>
+                  </pic:nvPicPr>
+                  <pic:blipFill>
+                    <a:blip r:embed="rId16"/>
+                    <a:stretch>
+                      <a:fillRect/>
+                    </a:stretch>
+                  </pic:blipFill>
+                  <pic:spPr>
+                    <a:xfrm>
+                      <a:off x="0" y="0"/>
+                      <a:ext cx="5029200" cy="1005840"/>
+                    </a:xfrm>
+                    <a:prstGeom prst="rect"/>
+                  </pic:spPr>
+                </pic:pic>
+              </a:graphicData>
+            </a:graphic>
+          </wp:inline>
+        </w:drawing>
+      </w:r>
+    </w:p>
+    <w:p/>
+    <w:p>
+      <w:r>
+        <w:t>Contenedor Docker corriendo</w:t>
+      </w:r>
+    </w:p>
+    <w:p>
+      <w:pPr>
+        <w:jc w:val="center"/>
+      </w:pPr>
+      <w:r>
+        <w:drawing>
+          <wp:inline xmlns:a="http://schemas.openxmlformats.org/drawingml/2006/main" xmlns:pic="http://schemas.openxmlformats.org/drawingml/2006/picture">
+            <wp:extent cx="5029200" cy="415350"/>
+            <wp:docPr id="9" name="Picture 9"/>
+            <wp:cNvGraphicFramePr>
+              <a:graphicFrameLocks noChangeAspect="1"/>
+            </wp:cNvGraphicFramePr>
+            <a:graphic>
+              <a:graphicData uri="http://schemas.openxmlformats.org/drawingml/2006/picture">
+                <pic:pic>
+                  <pic:nvPicPr>
+                    <pic:cNvPr id="0" name="docker_ps.png"/>
+                    <pic:cNvPicPr/>
+                  </pic:nvPicPr>
+                  <pic:blipFill>
+                    <a:blip r:embed="rId17"/>
+                    <a:stretch>
+                      <a:fillRect/>
+                    </a:stretch>
+                  </pic:blipFill>
+                  <pic:spPr>
+                    <a:xfrm>
+                      <a:off x="0" y="0"/>
+                      <a:ext cx="5029200" cy="415350"/>
+                    </a:xfrm>
+                    <a:prstGeom prst="rect"/>
+                  </pic:spPr>
+                </pic:pic>
+              </a:graphicData>
+            </a:graphic>
+          </wp:inline>
+        </w:drawing>
+      </w:r>
+    </w:p>
+    <w:p/>
+    <w:p>
+      <w:r>
+        <w:t>Estructura de archivos del proyecto</w:t>
+      </w:r>
+    </w:p>
+    <w:p>
+      <w:pPr>
+        <w:jc w:val="center"/>
+      </w:pPr>
+      <w:r>
+        <w:drawing>
+          <wp:inline xmlns:a="http://schemas.openxmlformats.org/drawingml/2006/main" xmlns:pic="http://schemas.openxmlformats.org/drawingml/2006/picture">
+            <wp:extent cx="5029200" cy="7376160"/>
+            <wp:docPr id="10" name="Picture 10"/>
+            <wp:cNvGraphicFramePr>
+              <a:graphicFrameLocks noChangeAspect="1"/>
+            </wp:cNvGraphicFramePr>
+            <a:graphic>
+              <a:graphicData uri="http://schemas.openxmlformats.org/drawingml/2006/picture">
+                <pic:pic>
+                  <pic:nvPicPr>
+                    <pic:cNvPr id="0" name="estructura.png"/>
+                    <pic:cNvPicPr/>
+                  </pic:nvPicPr>
+                  <pic:blipFill>
+                    <a:blip r:embed="rId18"/>
+                    <a:stretch>
+                      <a:fillRect/>
+                    </a:stretch>
+                  </pic:blipFill>
+                  <pic:spPr>
+                    <a:xfrm>
+                      <a:off x="0" y="0"/>
+                      <a:ext cx="5029200" cy="7376160"/>
+                    </a:xfrm>
+                    <a:prstGeom prst="rect"/>
+                  </pic:spPr>
+                </pic:pic>
+              </a:graphicData>
+            </a:graphic>
+          </wp:inline>
+        </w:drawing>
+      </w:r>
+    </w:p>
+    <w:p/>
     <w:sectPr>
       <w:pgSz w:w="12240" w:h="15840"/>
       <w:pgMar w:top="1440" w:right="1800" w:bottom="1440" w:left="1800" w:header="720" w:footer="720" w:gutter="0"/>

</xml_diff>